<commit_message>
Docs: add PEAD/seasonality/combiner case studies + combinations & honest-ROI report (Word + md)
- EDGE_CASE_STUDIES: +3 cases (PEAD encouraging-but-unvalidated, seasonality uncorrelated
  overlay, portfolio combination edge-supply-limited) + Deflated-Sharpe methodology note;
  scoreboard + bottom line updated. 16 case studies total.
- COMBINATIONS_AND_LOOPS (new): diversification-of-Sharpe math, our measured combiner result
  (legs uncorrelated 0.05, combined ~0.87, dilution lesson), real-vs-hype on AI loops (RL/
  bandits = hype here; inverse-vol + meta-labeling + DSR = real), and the brutally-honest
  daily-ROI answer (~2-5 bps/day under ~15-20x noise; per-day targeting = noise-mining).
- Regenerated all .docx via scripts/md_to_docx.py.

Co-Authored-By: Claude Opus 4.8 <noreply@anthropic.com>
</commit_message>
<xml_diff>
--- a/docs/EDGE_CASE_STUDIES.docx
+++ b/docs/EDGE_CASE_STUDIES.docx
@@ -184,16 +184,18 @@
         <w:tblLook w:firstColumn="1" w:firstRow="1" w:lastColumn="0" w:lastRow="0" w:noHBand="0" w:noVBand="1" w:val="04A0"/>
       </w:tblPr>
       <w:tblGrid>
-        <w:gridCol w:w="1728"/>
-        <w:gridCol w:w="1728"/>
-        <w:gridCol w:w="1728"/>
-        <w:gridCol w:w="1728"/>
-        <w:gridCol w:w="1728"/>
+        <w:gridCol w:w="1234"/>
+        <w:gridCol w:w="1234"/>
+        <w:gridCol w:w="1234"/>
+        <w:gridCol w:w="1234"/>
+        <w:gridCol w:w="1234"/>
+        <w:gridCol w:w="1234"/>
+        <w:gridCol w:w="1234"/>
       </w:tblGrid>
       <w:tr>
         <w:tc>
           <w:tcPr>
-            <w:tcW w:type="dxa" w:w="1728"/>
+            <w:tcW w:type="dxa" w:w="1234"/>
           </w:tcPr>
           <w:p>
             <w:r>
@@ -206,7 +208,7 @@
         </w:tc>
         <w:tc>
           <w:tcPr>
-            <w:tcW w:type="dxa" w:w="1728"/>
+            <w:tcW w:type="dxa" w:w="1234"/>
           </w:tcPr>
           <w:p>
             <w:r>
@@ -219,7 +221,7 @@
         </w:tc>
         <w:tc>
           <w:tcPr>
-            <w:tcW w:type="dxa" w:w="1728"/>
+            <w:tcW w:type="dxa" w:w="1234"/>
           </w:tcPr>
           <w:p>
             <w:r>
@@ -232,7 +234,7 @@
         </w:tc>
         <w:tc>
           <w:tcPr>
-            <w:tcW w:type="dxa" w:w="1728"/>
+            <w:tcW w:type="dxa" w:w="1234"/>
           </w:tcPr>
           <w:p>
             <w:r>
@@ -245,7 +247,7 @@
         </w:tc>
         <w:tc>
           <w:tcPr>
-            <w:tcW w:type="dxa" w:w="1728"/>
+            <w:tcW w:type="dxa" w:w="1234"/>
           </w:tcPr>
           <w:p>
             <w:r>
@@ -256,11 +258,23 @@
             </w:r>
           </w:p>
         </w:tc>
+        <w:tc>
+          <w:tcPr>
+            <w:tcW w:type="dxa" w:w="1234"/>
+          </w:tcPr>
+          <w:p/>
+        </w:tc>
+        <w:tc>
+          <w:tcPr>
+            <w:tcW w:type="dxa" w:w="1234"/>
+          </w:tcPr>
+          <w:p/>
+        </w:tc>
       </w:tr>
       <w:tr>
         <w:tc>
           <w:tcPr>
-            <w:tcW w:type="dxa" w:w="1728"/>
+            <w:tcW w:type="dxa" w:w="1234"/>
           </w:tcPr>
           <w:p>
             <w:r>
@@ -273,7 +287,7 @@
         </w:tc>
         <w:tc>
           <w:tcPr>
-            <w:tcW w:type="dxa" w:w="1728"/>
+            <w:tcW w:type="dxa" w:w="1234"/>
           </w:tcPr>
           <w:p>
             <w:r>
@@ -286,7 +300,7 @@
         </w:tc>
         <w:tc>
           <w:tcPr>
-            <w:tcW w:type="dxa" w:w="1728"/>
+            <w:tcW w:type="dxa" w:w="1234"/>
           </w:tcPr>
           <w:p>
             <w:r>
@@ -299,7 +313,7 @@
         </w:tc>
         <w:tc>
           <w:tcPr>
-            <w:tcW w:type="dxa" w:w="1728"/>
+            <w:tcW w:type="dxa" w:w="1234"/>
           </w:tcPr>
           <w:p>
             <w:r>
@@ -324,7 +338,7 @@
         </w:tc>
         <w:tc>
           <w:tcPr>
-            <w:tcW w:type="dxa" w:w="1728"/>
+            <w:tcW w:type="dxa" w:w="1234"/>
           </w:tcPr>
           <w:p>
             <w:r>
@@ -347,11 +361,23 @@
             </w:r>
           </w:p>
         </w:tc>
+        <w:tc>
+          <w:tcPr>
+            <w:tcW w:type="dxa" w:w="1234"/>
+          </w:tcPr>
+          <w:p/>
+        </w:tc>
+        <w:tc>
+          <w:tcPr>
+            <w:tcW w:type="dxa" w:w="1234"/>
+          </w:tcPr>
+          <w:p/>
+        </w:tc>
       </w:tr>
       <w:tr>
         <w:tc>
           <w:tcPr>
-            <w:tcW w:type="dxa" w:w="1728"/>
+            <w:tcW w:type="dxa" w:w="1234"/>
           </w:tcPr>
           <w:p>
             <w:r>
@@ -364,7 +390,7 @@
         </w:tc>
         <w:tc>
           <w:tcPr>
-            <w:tcW w:type="dxa" w:w="1728"/>
+            <w:tcW w:type="dxa" w:w="1234"/>
           </w:tcPr>
           <w:p>
             <w:r>
@@ -377,7 +403,7 @@
         </w:tc>
         <w:tc>
           <w:tcPr>
-            <w:tcW w:type="dxa" w:w="1728"/>
+            <w:tcW w:type="dxa" w:w="1234"/>
           </w:tcPr>
           <w:p>
             <w:r>
@@ -390,7 +416,7 @@
         </w:tc>
         <w:tc>
           <w:tcPr>
-            <w:tcW w:type="dxa" w:w="1728"/>
+            <w:tcW w:type="dxa" w:w="1234"/>
           </w:tcPr>
           <w:p>
             <w:r>
@@ -403,7 +429,7 @@
         </w:tc>
         <w:tc>
           <w:tcPr>
-            <w:tcW w:type="dxa" w:w="1728"/>
+            <w:tcW w:type="dxa" w:w="1234"/>
           </w:tcPr>
           <w:p>
             <w:r>
@@ -426,11 +452,23 @@
             </w:r>
           </w:p>
         </w:tc>
+        <w:tc>
+          <w:tcPr>
+            <w:tcW w:type="dxa" w:w="1234"/>
+          </w:tcPr>
+          <w:p/>
+        </w:tc>
+        <w:tc>
+          <w:tcPr>
+            <w:tcW w:type="dxa" w:w="1234"/>
+          </w:tcPr>
+          <w:p/>
+        </w:tc>
       </w:tr>
       <w:tr>
         <w:tc>
           <w:tcPr>
-            <w:tcW w:type="dxa" w:w="1728"/>
+            <w:tcW w:type="dxa" w:w="1234"/>
           </w:tcPr>
           <w:p>
             <w:r>
@@ -443,7 +481,7 @@
         </w:tc>
         <w:tc>
           <w:tcPr>
-            <w:tcW w:type="dxa" w:w="1728"/>
+            <w:tcW w:type="dxa" w:w="1234"/>
           </w:tcPr>
           <w:p>
             <w:r>
@@ -456,7 +494,7 @@
         </w:tc>
         <w:tc>
           <w:tcPr>
-            <w:tcW w:type="dxa" w:w="1728"/>
+            <w:tcW w:type="dxa" w:w="1234"/>
           </w:tcPr>
           <w:p>
             <w:r>
@@ -469,7 +507,7 @@
         </w:tc>
         <w:tc>
           <w:tcPr>
-            <w:tcW w:type="dxa" w:w="1728"/>
+            <w:tcW w:type="dxa" w:w="1234"/>
           </w:tcPr>
           <w:p>
             <w:r>
@@ -482,7 +520,7 @@
         </w:tc>
         <w:tc>
           <w:tcPr>
-            <w:tcW w:type="dxa" w:w="1728"/>
+            <w:tcW w:type="dxa" w:w="1234"/>
           </w:tcPr>
           <w:p>
             <w:r>
@@ -493,11 +531,23 @@
             </w:r>
           </w:p>
         </w:tc>
+        <w:tc>
+          <w:tcPr>
+            <w:tcW w:type="dxa" w:w="1234"/>
+          </w:tcPr>
+          <w:p/>
+        </w:tc>
+        <w:tc>
+          <w:tcPr>
+            <w:tcW w:type="dxa" w:w="1234"/>
+          </w:tcPr>
+          <w:p/>
+        </w:tc>
       </w:tr>
       <w:tr>
         <w:tc>
           <w:tcPr>
-            <w:tcW w:type="dxa" w:w="1728"/>
+            <w:tcW w:type="dxa" w:w="1234"/>
           </w:tcPr>
           <w:p>
             <w:r>
@@ -510,7 +560,7 @@
         </w:tc>
         <w:tc>
           <w:tcPr>
-            <w:tcW w:type="dxa" w:w="1728"/>
+            <w:tcW w:type="dxa" w:w="1234"/>
           </w:tcPr>
           <w:p>
             <w:r>
@@ -523,7 +573,7 @@
         </w:tc>
         <w:tc>
           <w:tcPr>
-            <w:tcW w:type="dxa" w:w="1728"/>
+            <w:tcW w:type="dxa" w:w="1234"/>
           </w:tcPr>
           <w:p>
             <w:r>
@@ -536,7 +586,7 @@
         </w:tc>
         <w:tc>
           <w:tcPr>
-            <w:tcW w:type="dxa" w:w="1728"/>
+            <w:tcW w:type="dxa" w:w="1234"/>
           </w:tcPr>
           <w:p>
             <w:r>
@@ -549,7 +599,7 @@
         </w:tc>
         <w:tc>
           <w:tcPr>
-            <w:tcW w:type="dxa" w:w="1728"/>
+            <w:tcW w:type="dxa" w:w="1234"/>
           </w:tcPr>
           <w:p>
             <w:r>
@@ -560,11 +610,23 @@
             </w:r>
           </w:p>
         </w:tc>
+        <w:tc>
+          <w:tcPr>
+            <w:tcW w:type="dxa" w:w="1234"/>
+          </w:tcPr>
+          <w:p/>
+        </w:tc>
+        <w:tc>
+          <w:tcPr>
+            <w:tcW w:type="dxa" w:w="1234"/>
+          </w:tcPr>
+          <w:p/>
+        </w:tc>
       </w:tr>
       <w:tr>
         <w:tc>
           <w:tcPr>
-            <w:tcW w:type="dxa" w:w="1728"/>
+            <w:tcW w:type="dxa" w:w="1234"/>
           </w:tcPr>
           <w:p>
             <w:r>
@@ -577,7 +639,7 @@
         </w:tc>
         <w:tc>
           <w:tcPr>
-            <w:tcW w:type="dxa" w:w="1728"/>
+            <w:tcW w:type="dxa" w:w="1234"/>
           </w:tcPr>
           <w:p>
             <w:r>
@@ -590,7 +652,7 @@
         </w:tc>
         <w:tc>
           <w:tcPr>
-            <w:tcW w:type="dxa" w:w="1728"/>
+            <w:tcW w:type="dxa" w:w="1234"/>
           </w:tcPr>
           <w:p>
             <w:r>
@@ -603,7 +665,7 @@
         </w:tc>
         <w:tc>
           <w:tcPr>
-            <w:tcW w:type="dxa" w:w="1728"/>
+            <w:tcW w:type="dxa" w:w="1234"/>
           </w:tcPr>
           <w:p>
             <w:r>
@@ -616,7 +678,7 @@
         </w:tc>
         <w:tc>
           <w:tcPr>
-            <w:tcW w:type="dxa" w:w="1728"/>
+            <w:tcW w:type="dxa" w:w="1234"/>
           </w:tcPr>
           <w:p>
             <w:r>
@@ -627,11 +689,23 @@
             </w:r>
           </w:p>
         </w:tc>
+        <w:tc>
+          <w:tcPr>
+            <w:tcW w:type="dxa" w:w="1234"/>
+          </w:tcPr>
+          <w:p/>
+        </w:tc>
+        <w:tc>
+          <w:tcPr>
+            <w:tcW w:type="dxa" w:w="1234"/>
+          </w:tcPr>
+          <w:p/>
+        </w:tc>
       </w:tr>
       <w:tr>
         <w:tc>
           <w:tcPr>
-            <w:tcW w:type="dxa" w:w="1728"/>
+            <w:tcW w:type="dxa" w:w="1234"/>
           </w:tcPr>
           <w:p>
             <w:r>
@@ -644,7 +718,7 @@
         </w:tc>
         <w:tc>
           <w:tcPr>
-            <w:tcW w:type="dxa" w:w="1728"/>
+            <w:tcW w:type="dxa" w:w="1234"/>
           </w:tcPr>
           <w:p>
             <w:r>
@@ -657,7 +731,7 @@
         </w:tc>
         <w:tc>
           <w:tcPr>
-            <w:tcW w:type="dxa" w:w="1728"/>
+            <w:tcW w:type="dxa" w:w="1234"/>
           </w:tcPr>
           <w:p>
             <w:r>
@@ -670,7 +744,7 @@
         </w:tc>
         <w:tc>
           <w:tcPr>
-            <w:tcW w:type="dxa" w:w="1728"/>
+            <w:tcW w:type="dxa" w:w="1234"/>
           </w:tcPr>
           <w:p>
             <w:r>
@@ -683,7 +757,7 @@
         </w:tc>
         <w:tc>
           <w:tcPr>
-            <w:tcW w:type="dxa" w:w="1728"/>
+            <w:tcW w:type="dxa" w:w="1234"/>
           </w:tcPr>
           <w:p>
             <w:r>
@@ -694,11 +768,23 @@
             </w:r>
           </w:p>
         </w:tc>
+        <w:tc>
+          <w:tcPr>
+            <w:tcW w:type="dxa" w:w="1234"/>
+          </w:tcPr>
+          <w:p/>
+        </w:tc>
+        <w:tc>
+          <w:tcPr>
+            <w:tcW w:type="dxa" w:w="1234"/>
+          </w:tcPr>
+          <w:p/>
+        </w:tc>
       </w:tr>
       <w:tr>
         <w:tc>
           <w:tcPr>
-            <w:tcW w:type="dxa" w:w="1728"/>
+            <w:tcW w:type="dxa" w:w="1234"/>
           </w:tcPr>
           <w:p>
             <w:r>
@@ -711,7 +797,7 @@
         </w:tc>
         <w:tc>
           <w:tcPr>
-            <w:tcW w:type="dxa" w:w="1728"/>
+            <w:tcW w:type="dxa" w:w="1234"/>
           </w:tcPr>
           <w:p>
             <w:r>
@@ -724,7 +810,7 @@
         </w:tc>
         <w:tc>
           <w:tcPr>
-            <w:tcW w:type="dxa" w:w="1728"/>
+            <w:tcW w:type="dxa" w:w="1234"/>
           </w:tcPr>
           <w:p>
             <w:r>
@@ -737,7 +823,7 @@
         </w:tc>
         <w:tc>
           <w:tcPr>
-            <w:tcW w:type="dxa" w:w="1728"/>
+            <w:tcW w:type="dxa" w:w="1234"/>
           </w:tcPr>
           <w:p>
             <w:r>
@@ -750,7 +836,7 @@
         </w:tc>
         <w:tc>
           <w:tcPr>
-            <w:tcW w:type="dxa" w:w="1728"/>
+            <w:tcW w:type="dxa" w:w="1234"/>
           </w:tcPr>
           <w:p>
             <w:r>
@@ -761,11 +847,23 @@
             </w:r>
           </w:p>
         </w:tc>
+        <w:tc>
+          <w:tcPr>
+            <w:tcW w:type="dxa" w:w="1234"/>
+          </w:tcPr>
+          <w:p/>
+        </w:tc>
+        <w:tc>
+          <w:tcPr>
+            <w:tcW w:type="dxa" w:w="1234"/>
+          </w:tcPr>
+          <w:p/>
+        </w:tc>
       </w:tr>
       <w:tr>
         <w:tc>
           <w:tcPr>
-            <w:tcW w:type="dxa" w:w="1728"/>
+            <w:tcW w:type="dxa" w:w="1234"/>
           </w:tcPr>
           <w:p>
             <w:r>
@@ -778,7 +876,7 @@
         </w:tc>
         <w:tc>
           <w:tcPr>
-            <w:tcW w:type="dxa" w:w="1728"/>
+            <w:tcW w:type="dxa" w:w="1234"/>
           </w:tcPr>
           <w:p>
             <w:r>
@@ -791,7 +889,7 @@
         </w:tc>
         <w:tc>
           <w:tcPr>
-            <w:tcW w:type="dxa" w:w="1728"/>
+            <w:tcW w:type="dxa" w:w="1234"/>
           </w:tcPr>
           <w:p>
             <w:r>
@@ -804,7 +902,7 @@
         </w:tc>
         <w:tc>
           <w:tcPr>
-            <w:tcW w:type="dxa" w:w="1728"/>
+            <w:tcW w:type="dxa" w:w="1234"/>
           </w:tcPr>
           <w:p>
             <w:r>
@@ -817,7 +915,7 @@
         </w:tc>
         <w:tc>
           <w:tcPr>
-            <w:tcW w:type="dxa" w:w="1728"/>
+            <w:tcW w:type="dxa" w:w="1234"/>
           </w:tcPr>
           <w:p>
             <w:r>
@@ -828,11 +926,23 @@
             </w:r>
           </w:p>
         </w:tc>
+        <w:tc>
+          <w:tcPr>
+            <w:tcW w:type="dxa" w:w="1234"/>
+          </w:tcPr>
+          <w:p/>
+        </w:tc>
+        <w:tc>
+          <w:tcPr>
+            <w:tcW w:type="dxa" w:w="1234"/>
+          </w:tcPr>
+          <w:p/>
+        </w:tc>
       </w:tr>
       <w:tr>
         <w:tc>
           <w:tcPr>
-            <w:tcW w:type="dxa" w:w="1728"/>
+            <w:tcW w:type="dxa" w:w="1234"/>
           </w:tcPr>
           <w:p>
             <w:r>
@@ -845,7 +955,7 @@
         </w:tc>
         <w:tc>
           <w:tcPr>
-            <w:tcW w:type="dxa" w:w="1728"/>
+            <w:tcW w:type="dxa" w:w="1234"/>
           </w:tcPr>
           <w:p>
             <w:r>
@@ -858,7 +968,7 @@
         </w:tc>
         <w:tc>
           <w:tcPr>
-            <w:tcW w:type="dxa" w:w="1728"/>
+            <w:tcW w:type="dxa" w:w="1234"/>
           </w:tcPr>
           <w:p>
             <w:r>
@@ -871,7 +981,7 @@
         </w:tc>
         <w:tc>
           <w:tcPr>
-            <w:tcW w:type="dxa" w:w="1728"/>
+            <w:tcW w:type="dxa" w:w="1234"/>
           </w:tcPr>
           <w:p>
             <w:r>
@@ -884,7 +994,7 @@
         </w:tc>
         <w:tc>
           <w:tcPr>
-            <w:tcW w:type="dxa" w:w="1728"/>
+            <w:tcW w:type="dxa" w:w="1234"/>
           </w:tcPr>
           <w:p>
             <w:r>
@@ -895,11 +1005,23 @@
             </w:r>
           </w:p>
         </w:tc>
+        <w:tc>
+          <w:tcPr>
+            <w:tcW w:type="dxa" w:w="1234"/>
+          </w:tcPr>
+          <w:p/>
+        </w:tc>
+        <w:tc>
+          <w:tcPr>
+            <w:tcW w:type="dxa" w:w="1234"/>
+          </w:tcPr>
+          <w:p/>
+        </w:tc>
       </w:tr>
       <w:tr>
         <w:tc>
           <w:tcPr>
-            <w:tcW w:type="dxa" w:w="1728"/>
+            <w:tcW w:type="dxa" w:w="1234"/>
           </w:tcPr>
           <w:p>
             <w:r>
@@ -912,7 +1034,7 @@
         </w:tc>
         <w:tc>
           <w:tcPr>
-            <w:tcW w:type="dxa" w:w="1728"/>
+            <w:tcW w:type="dxa" w:w="1234"/>
           </w:tcPr>
           <w:p>
             <w:r>
@@ -925,7 +1047,7 @@
         </w:tc>
         <w:tc>
           <w:tcPr>
-            <w:tcW w:type="dxa" w:w="1728"/>
+            <w:tcW w:type="dxa" w:w="1234"/>
           </w:tcPr>
           <w:p>
             <w:r>
@@ -938,7 +1060,7 @@
         </w:tc>
         <w:tc>
           <w:tcPr>
-            <w:tcW w:type="dxa" w:w="1728"/>
+            <w:tcW w:type="dxa" w:w="1234"/>
           </w:tcPr>
           <w:p>
             <w:r>
@@ -957,7 +1079,7 @@
         </w:tc>
         <w:tc>
           <w:tcPr>
-            <w:tcW w:type="dxa" w:w="1728"/>
+            <w:tcW w:type="dxa" w:w="1234"/>
           </w:tcPr>
           <w:p>
             <w:r>
@@ -968,11 +1090,23 @@
             </w:r>
           </w:p>
         </w:tc>
+        <w:tc>
+          <w:tcPr>
+            <w:tcW w:type="dxa" w:w="1234"/>
+          </w:tcPr>
+          <w:p/>
+        </w:tc>
+        <w:tc>
+          <w:tcPr>
+            <w:tcW w:type="dxa" w:w="1234"/>
+          </w:tcPr>
+          <w:p/>
+        </w:tc>
       </w:tr>
       <w:tr>
         <w:tc>
           <w:tcPr>
-            <w:tcW w:type="dxa" w:w="1728"/>
+            <w:tcW w:type="dxa" w:w="1234"/>
           </w:tcPr>
           <w:p>
             <w:r>
@@ -985,7 +1119,7 @@
         </w:tc>
         <w:tc>
           <w:tcPr>
-            <w:tcW w:type="dxa" w:w="1728"/>
+            <w:tcW w:type="dxa" w:w="1234"/>
           </w:tcPr>
           <w:p>
             <w:r>
@@ -998,7 +1132,7 @@
         </w:tc>
         <w:tc>
           <w:tcPr>
-            <w:tcW w:type="dxa" w:w="1728"/>
+            <w:tcW w:type="dxa" w:w="1234"/>
           </w:tcPr>
           <w:p>
             <w:r>
@@ -1011,7 +1145,7 @@
         </w:tc>
         <w:tc>
           <w:tcPr>
-            <w:tcW w:type="dxa" w:w="1728"/>
+            <w:tcW w:type="dxa" w:w="1234"/>
           </w:tcPr>
           <w:p>
             <w:r>
@@ -1024,7 +1158,7 @@
         </w:tc>
         <w:tc>
           <w:tcPr>
-            <w:tcW w:type="dxa" w:w="1728"/>
+            <w:tcW w:type="dxa" w:w="1234"/>
           </w:tcPr>
           <w:p>
             <w:r>
@@ -1035,11 +1169,23 @@
             </w:r>
           </w:p>
         </w:tc>
+        <w:tc>
+          <w:tcPr>
+            <w:tcW w:type="dxa" w:w="1234"/>
+          </w:tcPr>
+          <w:p/>
+        </w:tc>
+        <w:tc>
+          <w:tcPr>
+            <w:tcW w:type="dxa" w:w="1234"/>
+          </w:tcPr>
+          <w:p/>
+        </w:tc>
       </w:tr>
       <w:tr>
         <w:tc>
           <w:tcPr>
-            <w:tcW w:type="dxa" w:w="1728"/>
+            <w:tcW w:type="dxa" w:w="1234"/>
           </w:tcPr>
           <w:p>
             <w:r>
@@ -1052,7 +1198,7 @@
         </w:tc>
         <w:tc>
           <w:tcPr>
-            <w:tcW w:type="dxa" w:w="1728"/>
+            <w:tcW w:type="dxa" w:w="1234"/>
           </w:tcPr>
           <w:p>
             <w:r>
@@ -1065,7 +1211,7 @@
         </w:tc>
         <w:tc>
           <w:tcPr>
-            <w:tcW w:type="dxa" w:w="1728"/>
+            <w:tcW w:type="dxa" w:w="1234"/>
           </w:tcPr>
           <w:p>
             <w:r>
@@ -1078,7 +1224,7 @@
         </w:tc>
         <w:tc>
           <w:tcPr>
-            <w:tcW w:type="dxa" w:w="1728"/>
+            <w:tcW w:type="dxa" w:w="1234"/>
           </w:tcPr>
           <w:p>
             <w:r>
@@ -1091,7 +1237,7 @@
         </w:tc>
         <w:tc>
           <w:tcPr>
-            <w:tcW w:type="dxa" w:w="1728"/>
+            <w:tcW w:type="dxa" w:w="1234"/>
           </w:tcPr>
           <w:p>
             <w:r>
@@ -1102,11 +1248,23 @@
             </w:r>
           </w:p>
         </w:tc>
+        <w:tc>
+          <w:tcPr>
+            <w:tcW w:type="dxa" w:w="1234"/>
+          </w:tcPr>
+          <w:p/>
+        </w:tc>
+        <w:tc>
+          <w:tcPr>
+            <w:tcW w:type="dxa" w:w="1234"/>
+          </w:tcPr>
+          <w:p/>
+        </w:tc>
       </w:tr>
       <w:tr>
         <w:tc>
           <w:tcPr>
-            <w:tcW w:type="dxa" w:w="1728"/>
+            <w:tcW w:type="dxa" w:w="1234"/>
           </w:tcPr>
           <w:p>
             <w:r>
@@ -1119,7 +1277,7 @@
         </w:tc>
         <w:tc>
           <w:tcPr>
-            <w:tcW w:type="dxa" w:w="1728"/>
+            <w:tcW w:type="dxa" w:w="1234"/>
           </w:tcPr>
           <w:p>
             <w:r>
@@ -1132,7 +1290,7 @@
         </w:tc>
         <w:tc>
           <w:tcPr>
-            <w:tcW w:type="dxa" w:w="1728"/>
+            <w:tcW w:type="dxa" w:w="1234"/>
           </w:tcPr>
           <w:p>
             <w:r>
@@ -1145,7 +1303,7 @@
         </w:tc>
         <w:tc>
           <w:tcPr>
-            <w:tcW w:type="dxa" w:w="1728"/>
+            <w:tcW w:type="dxa" w:w="1234"/>
           </w:tcPr>
           <w:p>
             <w:r>
@@ -1158,7 +1316,7 @@
         </w:tc>
         <w:tc>
           <w:tcPr>
-            <w:tcW w:type="dxa" w:w="1728"/>
+            <w:tcW w:type="dxa" w:w="1234"/>
           </w:tcPr>
           <w:p>
             <w:r>
@@ -1169,6 +1327,293 @@
             </w:r>
           </w:p>
         </w:tc>
+        <w:tc>
+          <w:tcPr>
+            <w:tcW w:type="dxa" w:w="1234"/>
+          </w:tcPr>
+          <w:p/>
+        </w:tc>
+        <w:tc>
+          <w:tcPr>
+            <w:tcW w:type="dxa" w:w="1234"/>
+          </w:tcPr>
+          <w:p/>
+        </w:tc>
+      </w:tr>
+      <w:tr>
+        <w:tc>
+          <w:tcPr>
+            <w:tcW w:type="dxa" w:w="1234"/>
+          </w:tcPr>
+          <w:p>
+            <w:r>
+              <w:rPr>
+                <w:b w:val="0"/>
+              </w:rPr>
+              <w:t>14</w:t>
+            </w:r>
+          </w:p>
+        </w:tc>
+        <w:tc>
+          <w:tcPr>
+            <w:tcW w:type="dxa" w:w="1234"/>
+          </w:tcPr>
+          <w:p>
+            <w:r>
+              <w:rPr>
+                <w:b/>
+              </w:rPr>
+              <w:t>PEAD</w:t>
+            </w:r>
+            <w:r>
+              <w:rPr>
+                <w:b w:val="0"/>
+              </w:rPr>
+              <w:t xml:space="preserve"> (post-earnings drift, L/S)</w:t>
+            </w:r>
+          </w:p>
+        </w:tc>
+        <w:tc>
+          <w:tcPr>
+            <w:tcW w:type="dxa" w:w="1234"/>
+          </w:tcPr>
+          <w:p>
+            <w:r>
+              <w:rPr>
+                <w:b w:val="0"/>
+              </w:rPr>
+              <w:t>Market-neutral event</w:t>
+            </w:r>
+          </w:p>
+        </w:tc>
+        <w:tc>
+          <w:tcPr>
+            <w:tcW w:type="dxa" w:w="1234"/>
+          </w:tcPr>
+          <w:p>
+            <w:r>
+              <w:rPr>
+                <w:b w:val="0"/>
+              </w:rPr>
+              <w:t>Dollar-neutral Sharpe 0.66–0.82; short leg carries it</w:t>
+            </w:r>
+          </w:p>
+        </w:tc>
+        <w:tc>
+          <w:tcPr>
+            <w:tcW w:type="dxa" w:w="1234"/>
+          </w:tcPr>
+          <w:p>
+            <w:r>
+              <w:rPr>
+                <w:b w:val="0"/>
+              </w:rPr>
+              <w:t xml:space="preserve">🟡 </w:t>
+            </w:r>
+            <w:r>
+              <w:rPr>
+                <w:b/>
+              </w:rPr>
+              <w:t>Encouraging, unvalidated</w:t>
+            </w:r>
+            <w:r>
+              <w:rPr>
+                <w:b w:val="0"/>
+              </w:rPr>
+              <w:t xml:space="preserve"> (~1yr)</w:t>
+            </w:r>
+          </w:p>
+        </w:tc>
+        <w:tc>
+          <w:tcPr>
+            <w:tcW w:type="dxa" w:w="1234"/>
+          </w:tcPr>
+          <w:p/>
+        </w:tc>
+        <w:tc>
+          <w:tcPr>
+            <w:tcW w:type="dxa" w:w="1234"/>
+          </w:tcPr>
+          <w:p/>
+        </w:tc>
+      </w:tr>
+      <w:tr>
+        <w:tc>
+          <w:tcPr>
+            <w:tcW w:type="dxa" w:w="1234"/>
+          </w:tcPr>
+          <w:p>
+            <w:r>
+              <w:rPr>
+                <w:b w:val="0"/>
+              </w:rPr>
+              <w:t>15</w:t>
+            </w:r>
+          </w:p>
+        </w:tc>
+        <w:tc>
+          <w:tcPr>
+            <w:tcW w:type="dxa" w:w="1234"/>
+          </w:tcPr>
+          <w:p>
+            <w:r>
+              <w:rPr>
+                <w:b w:val="0"/>
+              </w:rPr>
+              <w:t>Seasonality (turn-of-month, pre-FOMC)</w:t>
+            </w:r>
+          </w:p>
+        </w:tc>
+        <w:tc>
+          <w:tcPr>
+            <w:tcW w:type="dxa" w:w="1234"/>
+          </w:tcPr>
+          <w:p>
+            <w:r>
+              <w:rPr>
+                <w:b w:val="0"/>
+              </w:rPr>
+              <w:t>Event-clock overlay</w:t>
+            </w:r>
+          </w:p>
+        </w:tc>
+        <w:tc>
+          <w:tcPr>
+            <w:tcW w:type="dxa" w:w="1234"/>
+          </w:tcPr>
+          <w:p>
+            <w:r>
+              <w:rPr>
+                <w:b w:val="0"/>
+              </w:rPr>
+              <w:t>Standalone Sharpe 0.24–0.34, exposure 3–34%</w:t>
+            </w:r>
+          </w:p>
+        </w:tc>
+        <w:tc>
+          <w:tcPr>
+            <w:tcW w:type="dxa" w:w="1234"/>
+          </w:tcPr>
+          <w:p>
+            <w:r>
+              <w:rPr>
+                <w:b w:val="0"/>
+              </w:rPr>
+              <w:t>⚠️ Weak alone; ✅ uncorrelated leg</w:t>
+            </w:r>
+          </w:p>
+        </w:tc>
+        <w:tc>
+          <w:tcPr>
+            <w:tcW w:type="dxa" w:w="1234"/>
+          </w:tcPr>
+          <w:p/>
+        </w:tc>
+        <w:tc>
+          <w:tcPr>
+            <w:tcW w:type="dxa" w:w="1234"/>
+          </w:tcPr>
+          <w:p/>
+        </w:tc>
+      </w:tr>
+      <w:tr>
+        <w:tc>
+          <w:tcPr>
+            <w:tcW w:type="dxa" w:w="1234"/>
+          </w:tcPr>
+          <w:p>
+            <w:r>
+              <w:rPr>
+                <w:b w:val="0"/>
+              </w:rPr>
+              <w:t>16</w:t>
+            </w:r>
+          </w:p>
+        </w:tc>
+        <w:tc>
+          <w:tcPr>
+            <w:tcW w:type="dxa" w:w="1234"/>
+          </w:tcPr>
+          <w:p>
+            <w:r>
+              <w:rPr>
+                <w:b/>
+              </w:rPr>
+              <w:t>Portfolio combination</w:t>
+            </w:r>
+            <w:r>
+              <w:rPr>
+                <w:b w:val="0"/>
+              </w:rPr>
+              <w:t xml:space="preserve"> (inverse-vol blend)</w:t>
+            </w:r>
+          </w:p>
+        </w:tc>
+        <w:tc>
+          <w:tcPr>
+            <w:tcW w:type="dxa" w:w="1234"/>
+          </w:tcPr>
+          <w:p>
+            <w:r>
+              <w:rPr>
+                <w:b w:val="0"/>
+              </w:rPr>
+              <w:t>Allocation</w:t>
+            </w:r>
+          </w:p>
+        </w:tc>
+        <w:tc>
+          <w:tcPr>
+            <w:tcW w:type="dxa" w:w="1234"/>
+          </w:tcPr>
+          <w:p>
+            <w:r>
+              <w:rPr>
+                <w:b w:val="0"/>
+              </w:rPr>
+              <w:t>5 legs avg \</w:t>
+            </w:r>
+          </w:p>
+        </w:tc>
+        <w:tc>
+          <w:tcPr>
+            <w:tcW w:type="dxa" w:w="1234"/>
+          </w:tcPr>
+          <w:p>
+            <w:r>
+              <w:rPr>
+                <w:b w:val="0"/>
+              </w:rPr>
+              <w:t>corr\</w:t>
+            </w:r>
+          </w:p>
+        </w:tc>
+        <w:tc>
+          <w:tcPr>
+            <w:tcW w:type="dxa" w:w="1234"/>
+          </w:tcPr>
+          <w:p>
+            <w:r>
+              <w:rPr>
+                <w:b w:val="0"/>
+              </w:rPr>
+              <w:t>0.05; combined ~0.87 ≈ null</w:t>
+            </w:r>
+          </w:p>
+        </w:tc>
+        <w:tc>
+          <w:tcPr>
+            <w:tcW w:type="dxa" w:w="1234"/>
+          </w:tcPr>
+          <w:p>
+            <w:r>
+              <w:rPr>
+                <w:b w:val="0"/>
+              </w:rPr>
+              <w:t>⚙️ Method works; edge-supply-limited</w:t>
+            </w:r>
+          </w:p>
+        </w:tc>
       </w:tr>
     </w:tbl>
     <w:p/>
@@ -2914,6 +3359,703 @@
         <w:pStyle w:val="Heading2"/>
       </w:pPr>
       <w:r>
+        <w:t>Case 14 — PEAD (post-earnings-announcement drift) 🟡 (encouraging, unvalidated)</w:t>
+      </w:r>
+    </w:p>
+    <w:p>
+      <w:pPr>
+        <w:pStyle w:val="ListBullet"/>
+      </w:pPr>
+      <w:r>
+        <w:rPr>
+          <w:b/>
+        </w:rPr>
+        <w:t>Hypothesis.</w:t>
+      </w:r>
+      <w:r>
+        <w:rPr>
+          <w:b w:val="0"/>
+        </w:rPr>
+        <w:t xml:space="preserve"> A stock that beats consensus keeps drifting up for weeks (and misses drift</w:t>
+      </w:r>
+    </w:p>
+    <w:p>
+      <w:r>
+        <w:rPr>
+          <w:b w:val="0"/>
+        </w:rPr>
+        <w:t xml:space="preserve">  down). Long high-surprise / short low-surprise, dollar-neutral — event-driven and</w:t>
+      </w:r>
+    </w:p>
+    <w:p>
+      <w:r>
+        <w:rPr>
+          <w:b w:val="0"/>
+        </w:rPr>
+        <w:t xml:space="preserve">  cross-sectional, so genuinely *diversifying* from price-mean-reversion pairs.</w:t>
+      </w:r>
+    </w:p>
+    <w:p>
+      <w:pPr>
+        <w:pStyle w:val="ListBullet"/>
+      </w:pPr>
+      <w:r>
+        <w:rPr>
+          <w:b/>
+        </w:rPr>
+        <w:t>Method.</w:t>
+      </w:r>
+      <w:r>
+        <w:rPr>
+          <w:b w:val="0"/>
+        </w:rPr>
+        <w:t xml:space="preserve"> Earnings surprise from the free Nasdaq endpoint (no key, ~4 quarters/ticker);</w:t>
+      </w:r>
+    </w:p>
+    <w:p>
+      <w:r>
+        <w:rPr>
+          <w:b w:val="0"/>
+        </w:rPr>
+        <w:t xml:space="preserve">  long if surprise &gt; +thr, short if &lt; −thr, hold 30 trading days from the day after the</w:t>
+      </w:r>
+    </w:p>
+    <w:p>
+      <w:r>
+        <w:rPr>
+          <w:b w:val="0"/>
+        </w:rPr>
+        <w:t xml:space="preserve">  report. Long, short, and dollar-neutral legs judged </w:t>
+      </w:r>
+      <w:r>
+        <w:rPr>
+          <w:b/>
+        </w:rPr>
+        <w:t>separately</w:t>
+      </w:r>
+      <w:r>
+        <w:rPr>
+          <w:b w:val="0"/>
+        </w:rPr>
+        <w:t>. 167 symbols, 665 events.</w:t>
+      </w:r>
+    </w:p>
+    <w:p>
+      <w:pPr>
+        <w:pStyle w:val="ListBullet"/>
+      </w:pPr>
+      <w:r>
+        <w:rPr>
+          <w:b/>
+        </w:rPr>
+        <w:t>Result.</w:t>
+      </w:r>
+      <w:r>
+        <w:rPr>
+          <w:b w:val="0"/>
+        </w:rPr>
+        <w:t xml:space="preserve"> Dollar-neutral Sharpe </w:t>
+      </w:r>
+      <w:r>
+        <w:rPr>
+          <w:b/>
+        </w:rPr>
+        <w:t>0.66</w:t>
+      </w:r>
+      <w:r>
+        <w:rPr>
+          <w:b w:val="0"/>
+        </w:rPr>
+        <w:t xml:space="preserve"> (and </w:t>
+      </w:r>
+      <w:r>
+        <w:rPr>
+          <w:b/>
+        </w:rPr>
+        <w:t>0.82</w:t>
+      </w:r>
+      <w:r>
+        <w:rPr>
+          <w:b w:val="0"/>
+        </w:rPr>
+        <w:t xml:space="preserve"> at a stricter ±3% threshold),</w:t>
+      </w:r>
+    </w:p>
+    <w:p>
+      <w:r>
+        <w:rPr>
+          <w:b w:val="0"/>
+        </w:rPr>
+        <w:t xml:space="preserve">  −8% maxDD. The </w:t>
+      </w:r>
+      <w:r>
+        <w:rPr>
+          <w:b/>
+        </w:rPr>
+        <w:t>short leg carries it (0.50) vs the long leg (0.32)</w:t>
+      </w:r>
+      <w:r>
+        <w:rPr>
+          <w:b w:val="0"/>
+        </w:rPr>
+        <w:t xml:space="preserve"> — exactly as theory</w:t>
+      </w:r>
+    </w:p>
+    <w:p>
+      <w:r>
+        <w:rPr>
+          <w:b w:val="0"/>
+        </w:rPr>
+        <w:t xml:space="preserve">  predicts (the long leg is mostly beta; neutral alpha lives in the short).</w:t>
+      </w:r>
+    </w:p>
+    <w:p>
+      <w:pPr>
+        <w:pStyle w:val="ListBullet"/>
+      </w:pPr>
+      <w:r>
+        <w:rPr>
+          <w:b/>
+        </w:rPr>
+        <w:t>Verdict.</w:t>
+      </w:r>
+      <w:r>
+        <w:rPr>
+          <w:b w:val="0"/>
+        </w:rPr>
+        <w:t xml:space="preserve"> 🟡 </w:t>
+      </w:r>
+      <w:r>
+        <w:rPr>
+          <w:b/>
+        </w:rPr>
+        <w:t>The first new candidate that didn't immediately die — but NOT validated.</w:t>
+      </w:r>
+    </w:p>
+    <w:p>
+      <w:r>
+        <w:rPr>
+          <w:b w:val="0"/>
+        </w:rPr>
+        <w:t xml:space="preserve">  The honest caveat is decisive: in-sample Sharpe is </w:t>
+      </w:r>
+      <w:r>
+        <w:rPr>
+          <w:b/>
+        </w:rPr>
+        <w:t>0.00</w:t>
+      </w:r>
+      <w:r>
+        <w:rPr>
+          <w:b w:val="0"/>
+        </w:rPr>
+        <w:t xml:space="preserve"> across all configs because the</w:t>
+      </w:r>
+    </w:p>
+    <w:p>
+      <w:r>
+        <w:rPr>
+          <w:b w:val="0"/>
+        </w:rPr>
+        <w:t xml:space="preserve">  free data only covers ~1 year, so positions only populate the back half — the "OOS 1.21" is</w:t>
+      </w:r>
+    </w:p>
+    <w:p>
+      <w:r>
+        <w:rPr>
+          <w:b w:val="0"/>
+        </w:rPr>
+        <w:t xml:space="preserve">  *not* a clean walk-forward, just the active window. Single regime, weak power, paper-shorting</w:t>
+      </w:r>
+    </w:p>
+    <w:p>
+      <w:r>
+        <w:rPr>
+          <w:b w:val="0"/>
+        </w:rPr>
+        <w:t xml:space="preserve">  realism unmodeled. </w:t>
+      </w:r>
+      <w:r>
+        <w:rPr>
+          <w:b/>
+        </w:rPr>
+        <w:t>To judge it properly needs multi-year history (a free Finnhub key).</w:t>
+      </w:r>
+    </w:p>
+    <w:p>
+      <w:pPr>
+        <w:pStyle w:val="ListBullet"/>
+      </w:pPr>
+      <w:r>
+        <w:rPr>
+          <w:b/>
+        </w:rPr>
+        <w:t>Next step.</w:t>
+      </w:r>
+      <w:r>
+        <w:rPr>
+          <w:b w:val="0"/>
+        </w:rPr>
+        <w:t xml:space="preserve"> Add `FINNHUB_API_KEY`, pull 5+ years, re-run with a real walk-forward + DSR.</w:t>
+      </w:r>
+    </w:p>
+    <w:p>
+      <w:pPr>
+        <w:pStyle w:val="Heading2"/>
+      </w:pPr>
+      <w:r>
+        <w:t>Case 15 — Calendar seasonality (turn-of-month, pre-FOMC) ⚠️/✅</w:t>
+      </w:r>
+    </w:p>
+    <w:p>
+      <w:pPr>
+        <w:pStyle w:val="ListBullet"/>
+      </w:pPr>
+      <w:r>
+        <w:rPr>
+          <w:b/>
+        </w:rPr>
+        <w:t>Hypothesis.</w:t>
+      </w:r>
+      <w:r>
+        <w:rPr>
+          <w:b w:val="0"/>
+        </w:rPr>
+        <w:t xml:space="preserve"> Long an index ETF only around month-end flows (turn-of-month) or the ~24h</w:t>
+      </w:r>
+    </w:p>
+    <w:p>
+      <w:r>
+        <w:rPr>
+          <w:b w:val="0"/>
+        </w:rPr>
+        <w:t xml:space="preserve">  before scheduled FOMC announcements (Lucca-Moench drift); flat otherwise.</w:t>
+      </w:r>
+    </w:p>
+    <w:p>
+      <w:pPr>
+        <w:pStyle w:val="ListBullet"/>
+      </w:pPr>
+      <w:r>
+        <w:rPr>
+          <w:b/>
+        </w:rPr>
+        <w:t>Result</w:t>
+      </w:r>
+      <w:r>
+        <w:rPr>
+          <w:b w:val="0"/>
+        </w:rPr>
+        <w:t xml:space="preserve"> (SPY/QQQ, ~2021-2026): standalone Sharpe 0.24–0.34 (turn-of-month, 34% exposure)</w:t>
+      </w:r>
+    </w:p>
+    <w:p>
+      <w:r>
+        <w:rPr>
+          <w:b w:val="0"/>
+        </w:rPr>
+        <w:t xml:space="preserve">  and 0.24–0.60 (pre-FOMC, 3% exposure) — below buy-and-hold's 0.80+ on absolute return, and</w:t>
+      </w:r>
+    </w:p>
+    <w:p>
+      <w:r>
+        <w:rPr>
+          <w:b w:val="0"/>
+        </w:rPr>
+        <w:t xml:space="preserve">  OOS-negative standalone (our window can't test the documented pre-2011 vs post-2011 decay).</w:t>
+      </w:r>
+    </w:p>
+    <w:p>
+      <w:pPr>
+        <w:pStyle w:val="ListBullet"/>
+      </w:pPr>
+      <w:r>
+        <w:rPr>
+          <w:b/>
+        </w:rPr>
+        <w:t>Verdict.</w:t>
+      </w:r>
+      <w:r>
+        <w:rPr>
+          <w:b w:val="0"/>
+        </w:rPr>
+        <w:t xml:space="preserve"> ⚠️ </w:t>
+      </w:r>
+      <w:r>
+        <w:rPr>
+          <w:b/>
+        </w:rPr>
+        <w:t>Weak as a standalone strategy</w:t>
+      </w:r>
+      <w:r>
+        <w:rPr>
+          <w:b w:val="0"/>
+        </w:rPr>
+        <w:t xml:space="preserve"> (cash-parked most days) **but ✅ valuable as</w:t>
+      </w:r>
+    </w:p>
+    <w:p>
+      <w:r>
+        <w:rPr>
+          <w:b w:val="0"/>
+        </w:rPr>
+        <w:t xml:space="preserve">  an uncorrelated leg** — its PnL is on an *event clock*, so it correlates ~0 with every</w:t>
+      </w:r>
+    </w:p>
+    <w:p>
+      <w:r>
+        <w:rPr>
+          <w:b w:val="0"/>
+        </w:rPr>
+        <w:t xml:space="preserve">  price-driven strategy (see Case 16). That structural ρ≈0 is its entire value.</w:t>
+      </w:r>
+    </w:p>
+    <w:p>
+      <w:pPr>
+        <w:pStyle w:val="Heading2"/>
+      </w:pPr>
+      <w:r>
+        <w:t>Case 16 — Portfolio combination (inverse-vol + half-Kelly blend) ⚙️</w:t>
+      </w:r>
+    </w:p>
+    <w:p>
+      <w:pPr>
+        <w:pStyle w:val="ListBullet"/>
+      </w:pPr>
+      <w:r>
+        <w:rPr>
+          <w:b/>
+        </w:rPr>
+        <w:t>The math.</w:t>
+      </w:r>
+      <w:r>
+        <w:rPr>
+          <w:b w:val="0"/>
+        </w:rPr>
+        <w:t xml:space="preserve"> Combining k equal-risk legs of Sharpe S, avg correlation ρ, gives</w:t>
+      </w:r>
+    </w:p>
+    <w:p>
+      <w:r>
+        <w:rPr>
+          <w:b w:val="0"/>
+        </w:rPr>
+        <w:t xml:space="preserve">  `S·√k / √(1+(k−1)ρ)`. Four uncorrelated 0.5-legs → 1.0; at ρ=0.3 → only 0.69. **Correlation</w:t>
+      </w:r>
+    </w:p>
+    <w:p>
+      <w:r>
+        <w:rPr>
+          <w:b w:val="0"/>
+        </w:rPr>
+        <w:t xml:space="preserve">  is destiny** — stacking correlated betas buys nothing (which is why momentum/reversal/TSMOM/</w:t>
+      </w:r>
+    </w:p>
+    <w:p>
+      <w:r>
+        <w:rPr>
+          <w:b w:val="0"/>
+        </w:rPr>
+        <w:t xml:space="preserve">  PCA stacking did nothing: they were secretly the same beta).</w:t>
+      </w:r>
+    </w:p>
+    <w:p>
+      <w:pPr>
+        <w:pStyle w:val="ListBullet"/>
+      </w:pPr>
+      <w:r>
+        <w:rPr>
+          <w:b/>
+        </w:rPr>
+        <w:t>Method.</w:t>
+      </w:r>
+      <w:r>
+        <w:rPr>
+          <w:b w:val="0"/>
+        </w:rPr>
+        <w:t xml:space="preserve"> A real combiner (`backtest/combine.py`): measures the cross-leg correlation</w:t>
+      </w:r>
+    </w:p>
+    <w:p>
+      <w:r>
+        <w:rPr>
+          <w:b w:val="0"/>
+        </w:rPr>
+        <w:t xml:space="preserve">  matrix, blends by inverse-vol + a half-Kelly leverage cap (de Prado's robust default at low</w:t>
+      </w:r>
+    </w:p>
+    <w:p>
+      <w:r>
+        <w:rPr>
+          <w:b w:val="0"/>
+        </w:rPr>
+        <w:t xml:space="preserve">  N), reports combined Sharpe vs the equal-weight null, and translates Sharpe → expected</w:t>
+      </w:r>
+    </w:p>
+    <w:p>
+      <w:r>
+        <w:rPr>
+          <w:b w:val="0"/>
+        </w:rPr>
+        <w:t xml:space="preserve">  daily/annual return. Tested on 5 *real* legs: pairs basket (MN), rsi-mr (beta), cross-</w:t>
+      </w:r>
+    </w:p>
+    <w:p>
+      <w:r>
+        <w:rPr>
+          <w:b w:val="0"/>
+        </w:rPr>
+        <w:t xml:space="preserve">  sectional (MN), turn-of-month, pre-FOMC.</w:t>
+      </w:r>
+    </w:p>
+    <w:p>
+      <w:pPr>
+        <w:pStyle w:val="ListBullet"/>
+      </w:pPr>
+      <w:r>
+        <w:rPr>
+          <w:b/>
+        </w:rPr>
+        <w:t>Result.</w:t>
+      </w:r>
+      <w:r>
+        <w:rPr>
+          <w:b w:val="0"/>
+        </w:rPr>
+        <w:t xml:space="preserve"> The legs are genuinely uncorrelated (avg |off-diagonal corr| </w:t>
+      </w:r>
+      <w:r>
+        <w:rPr>
+          <w:b/>
+        </w:rPr>
+        <w:t>0.05</w:t>
+      </w:r>
+      <w:r>
+        <w:rPr>
+          <w:b w:val="0"/>
+        </w:rPr>
+        <w:t>), and the</w:t>
+      </w:r>
+    </w:p>
+    <w:p>
+      <w:r>
+        <w:rPr>
+          <w:b w:val="0"/>
+        </w:rPr>
+        <w:t xml:space="preserve">  inverse-vol blend beats/ties the equal-weight null (~</w:t>
+      </w:r>
+      <w:r>
+        <w:rPr>
+          <w:b/>
+        </w:rPr>
+        <w:t>0.87</w:t>
+      </w:r>
+      <w:r>
+        <w:rPr>
+          <w:b w:val="0"/>
+        </w:rPr>
+        <w:t>). BUT the combined Sharpe sits</w:t>
+      </w:r>
+    </w:p>
+    <w:p>
+      <w:r>
+        <w:rPr>
+          <w:b w:val="0"/>
+        </w:rPr>
+        <w:t xml:space="preserve">  *below* the best single leg, because four of five legs are weak (0.0–0.4): **combining one</w:t>
+      </w:r>
+    </w:p>
+    <w:p>
+      <w:r>
+        <w:rPr>
+          <w:b w:val="0"/>
+        </w:rPr>
+        <w:t xml:space="preserve">  good leg with weak diversifiers dilutes, it doesn't lift.** The diversification formula only</w:t>
+      </w:r>
+    </w:p>
+    <w:p>
+      <w:r>
+        <w:rPr>
+          <w:b w:val="0"/>
+        </w:rPr>
+        <w:t xml:space="preserve">  delivers when you have *several genuinely-good* uncorrelated edges — which we don't.</w:t>
+      </w:r>
+    </w:p>
+    <w:p>
+      <w:pPr>
+        <w:pStyle w:val="ListBullet"/>
+      </w:pPr>
+      <w:r>
+        <w:rPr>
+          <w:b/>
+        </w:rPr>
+        <w:t>Honest ROI translation.</w:t>
+      </w:r>
+      <w:r>
+        <w:rPr>
+          <w:b w:val="0"/>
+        </w:rPr>
+        <w:t xml:space="preserve"> At the achieved combined Sharpe (~0.87) and an 8% vol target:</w:t>
+      </w:r>
+    </w:p>
+    <w:p>
+      <w:r>
+        <w:rPr>
+          <w:b w:val="0"/>
+        </w:rPr>
+        <w:t xml:space="preserve">  ~5–9% / year ≈ </w:t>
+      </w:r>
+      <w:r>
+        <w:rPr>
+          <w:b/>
+        </w:rPr>
+        <w:t>~2 bps/day expected, under ~40 bps/day of noise (noise ≈ 18× the edge).</w:t>
+      </w:r>
+    </w:p>
+    <w:p>
+      <w:r>
+        <w:rPr>
+          <w:b w:val="0"/>
+        </w:rPr>
+        <w:t xml:space="preserve">  The edge is *invisible* day-to-day. </w:t>
+      </w:r>
+      <w:r>
+        <w:rPr>
+          <w:b/>
+        </w:rPr>
+        <w:t>"X% per day" targets are noise-mining</w:t>
+      </w:r>
+      <w:r>
+        <w:rPr>
+          <w:b w:val="0"/>
+        </w:rPr>
+        <w:t xml:space="preserve"> — the right</w:t>
+      </w:r>
+    </w:p>
+    <w:p>
+      <w:r>
+        <w:rPr>
+          <w:b w:val="0"/>
+        </w:rPr>
+        <w:t xml:space="preserve">  scoreboard is combined OOS Sharpe (deflated for trial count via DSR) and max drawdown.</w:t>
+      </w:r>
+    </w:p>
+    <w:p>
+      <w:pPr>
+        <w:pStyle w:val="ListBullet"/>
+      </w:pPr>
+      <w:r>
+        <w:rPr>
+          <w:b/>
+        </w:rPr>
+        <w:t>Verdict.</w:t>
+      </w:r>
+      <w:r>
+        <w:rPr>
+          <w:b w:val="0"/>
+        </w:rPr>
+        <w:t xml:space="preserve"> ⚙️ </w:t>
+      </w:r>
+      <w:r>
+        <w:rPr>
+          <w:b/>
+        </w:rPr>
+        <w:t>The method is real and is the single biggest lever</w:t>
+      </w:r>
+      <w:r>
+        <w:rPr>
+          <w:b w:val="0"/>
+        </w:rPr>
+        <w:t xml:space="preserve"> — but its output is</w:t>
+      </w:r>
+    </w:p>
+    <w:p>
+      <w:r>
+        <w:rPr>
+          <w:b w:val="0"/>
+        </w:rPr>
+        <w:t xml:space="preserve">  capped by the *supply of good uncorrelated edges*. The bottleneck is finding more real</w:t>
+      </w:r>
+    </w:p>
+    <w:p>
+      <w:r>
+        <w:rPr>
+          <w:b w:val="0"/>
+        </w:rPr>
+        <w:t xml:space="preserve">  edges (e.g. validating PEAD), not the allocator.</w:t>
+      </w:r>
+    </w:p>
+    <w:p>
+      <w:pPr>
+        <w:pStyle w:val="Heading2"/>
+      </w:pPr>
+      <w:r>
+        <w:t>Methodology upgrade — Deflated Sharpe Ratio</w:t>
+      </w:r>
+    </w:p>
+    <w:p>
+      <w:r>
+        <w:rPr>
+          <w:b w:val="0"/>
+        </w:rPr>
+        <w:t>Given how many strategies this project has tried (~34 in the registry + the dozen edge</w:t>
+      </w:r>
+    </w:p>
+    <w:p>
+      <w:r>
+        <w:rPr>
+          <w:b w:val="0"/>
+        </w:rPr>
+        <w:t>families here), naive p-values overstate significance. The harness now includes the</w:t>
+      </w:r>
+    </w:p>
+    <w:p>
+      <w:r>
+        <w:rPr>
+          <w:b/>
+        </w:rPr>
+        <w:t>Probabilistic</w:t>
+      </w:r>
+      <w:r>
+        <w:rPr>
+          <w:b w:val="0"/>
+        </w:rPr>
+        <w:t xml:space="preserve"> and </w:t>
+      </w:r>
+      <w:r>
+        <w:rPr>
+          <w:b/>
+        </w:rPr>
+        <w:t>Deflated Sharpe Ratio</w:t>
+      </w:r>
+      <w:r>
+        <w:rPr>
+          <w:b w:val="0"/>
+        </w:rPr>
+        <w:t xml:space="preserve"> (Bailey &amp; López de Prado): the DSR tests a</w:t>
+      </w:r>
+    </w:p>
+    <w:p>
+      <w:r>
+        <w:rPr>
+          <w:b w:val="0"/>
+        </w:rPr>
+        <w:t>Sharpe against the *expected maximum* Sharpe over the number of trials, so it accounts for</w:t>
+      </w:r>
+    </w:p>
+    <w:p>
+      <w:r>
+        <w:rPr>
+          <w:b w:val="0"/>
+        </w:rPr>
+        <w:t>selection bias. Use DSR &gt; 0.95 — not a raw p&lt;0.05 — as the real significance bar going forward.</w:t>
+      </w:r>
+    </w:p>
+    <w:p>
+      <w:pPr>
+        <w:pStyle w:val="Heading2"/>
+      </w:pPr>
+      <w:r>
         <w:t>What we learned</w:t>
       </w:r>
     </w:p>
@@ -3063,17 +4205,20 @@
       </w:r>
     </w:p>
     <w:p>
+      <w:pPr>
+        <w:pStyle w:val="ListNumber"/>
+      </w:pPr>
       <w:r>
         <w:rPr>
           <w:b/>
         </w:rPr>
-        <w:t>Bottom line:</w:t>
+        <w:t>Combining is the biggest lever, but it's edge-supply-limited.</w:t>
       </w:r>
       <w:r>
         <w:rPr>
           <w:b w:val="0"/>
         </w:rPr>
-        <w:t xml:space="preserve"> after equities (all families), crypto (daily + hourly), market-making, two</w:t>
+        <w:t xml:space="preserve"> The diversification-of-</w:t>
       </w:r>
     </w:p>
     <w:p>
@@ -3081,21 +4226,15 @@
         <w:rPr>
           <w:b w:val="0"/>
         </w:rPr>
-        <w:t>sizing/factor generalizations, a CTA edge, an alt-data probe, and a funding signal — the</w:t>
+        <w:t xml:space="preserve">   Sharpe math is real and our combiner works (legs uncorrelated at ρ≈0.05, beats the equal-</w:t>
       </w:r>
     </w:p>
     <w:p>
       <w:r>
         <w:rPr>
-          <w:b/>
-        </w:rPr>
-        <w:t>84-symbol cointegrated-pairs market-neutral basket (OOS Sharpe ~0.5)</w:t>
-      </w:r>
-      <w:r>
-        <w:rPr>
           <w:b w:val="0"/>
         </w:rPr>
-        <w:t xml:space="preserve"> remains the only</w:t>
+        <w:t xml:space="preserve">   weight null) — but you can't manufacture a high combined Sharpe from one good leg plus weak</w:t>
       </w:r>
     </w:p>
     <w:p>
@@ -3103,7 +4242,118 @@
         <w:rPr>
           <w:b w:val="0"/>
         </w:rPr>
-        <w:t>edge that has survived honest, out-of-sample testing.</w:t>
+        <w:t xml:space="preserve">   diversifiers. The constraint is the *supply of genuinely-good uncorrelated edges*.</w:t>
+      </w:r>
+    </w:p>
+    <w:p>
+      <w:pPr>
+        <w:pStyle w:val="ListNumber"/>
+      </w:pPr>
+      <w:r>
+        <w:rPr>
+          <w:b/>
+        </w:rPr>
+        <w:t>Daily-ROI is the wrong target.</w:t>
+      </w:r>
+      <w:r>
+        <w:rPr>
+          <w:b w:val="0"/>
+        </w:rPr>
+        <w:t xml:space="preserve"> At any honest Sharpe (0.5–1.2), the daily expected</w:t>
+      </w:r>
+    </w:p>
+    <w:p>
+      <w:r>
+        <w:rPr>
+          <w:b w:val="0"/>
+        </w:rPr>
+        <w:t xml:space="preserve">   return is ~2–5 bps, buried under ~40–60 bps of daily noise (noise ≈ 10–20× the edge). The</w:t>
+      </w:r>
+    </w:p>
+    <w:p>
+      <w:r>
+        <w:rPr>
+          <w:b w:val="0"/>
+        </w:rPr>
+        <w:t xml:space="preserve">   correct scoreboard is </w:t>
+      </w:r>
+      <w:r>
+        <w:rPr>
+          <w:b/>
+        </w:rPr>
+        <w:t>combined OOS Sharpe (DSR-deflated for trial count) and drawdown</w:t>
+      </w:r>
+      <w:r>
+        <w:rPr>
+          <w:b w:val="0"/>
+        </w:rPr>
+        <w:t>.</w:t>
+      </w:r>
+    </w:p>
+    <w:p>
+      <w:r>
+        <w:rPr>
+          <w:b/>
+        </w:rPr>
+        <w:t>Bottom line:</w:t>
+      </w:r>
+      <w:r>
+        <w:rPr>
+          <w:b w:val="0"/>
+        </w:rPr>
+        <w:t xml:space="preserve"> after equities (all families), crypto (daily + hourly), market-making, two</w:t>
+      </w:r>
+    </w:p>
+    <w:p>
+      <w:r>
+        <w:rPr>
+          <w:b w:val="0"/>
+        </w:rPr>
+        <w:t>sizing/factor generalizations, a CTA edge, an alt-data probe, a funding signal, seasonality,</w:t>
+      </w:r>
+    </w:p>
+    <w:p>
+      <w:r>
+        <w:rPr>
+          <w:b w:val="0"/>
+        </w:rPr>
+        <w:t>and a portfolio combiner — the **84-symbol cointegrated-pairs market-neutral basket (OOS</w:t>
+      </w:r>
+    </w:p>
+    <w:p>
+      <w:r>
+        <w:rPr>
+          <w:b w:val="0"/>
+        </w:rPr>
+        <w:t>Sharpe ~0.5)</w:t>
+      </w:r>
+      <w:r>
+        <w:rPr>
+          <w:b/>
+        </w:rPr>
+        <w:t xml:space="preserve"> remains the only fully-validated edge, with </w:t>
+      </w:r>
+      <w:r>
+        <w:rPr>
+          <w:b w:val="0"/>
+        </w:rPr>
+        <w:t>PEAD the one encouraging new</w:t>
+      </w:r>
+    </w:p>
+    <w:p>
+      <w:r>
+        <w:rPr>
+          <w:b w:val="0"/>
+        </w:rPr>
+        <w:t>lead** (dollar-neutral Sharpe ~0.7 on ~1yr, short-leg-carried) that's worth multi-year data to</w:t>
+      </w:r>
+    </w:p>
+    <w:p>
+      <w:r>
+        <w:rPr>
+          <w:b w:val="0"/>
+        </w:rPr>
+        <w:t>confirm. The combiner is ready to stack edges the moment a second validated one exists.</w:t>
       </w:r>
     </w:p>
     <w:sectPr>

</xml_diff>

<commit_message>
Model shorting realism on the PEAD short leg (borrow fee + locate); edge survives
backtest_pead now charges a daily stock-borrow fee on the short notional (borrow_apr: flat or
{symbol: apr}) and drops un-locatable names (no_borrow set). Borrow drag on a dollar-neutral
book is ~apr/2 per year (0.5 short notional).

STRESS RESULT (dollar-neutral, thr 2.0): Sharpe 0.61 (0% borrow) -> 0.58 at realistic large-cap
general-collateral borrow (~1%/yr) -> 0.53 at 3% -> 0.34 only under a 10% hard-to-borrow stress.
Our universe is liquid S&P large-caps (GC), so the PEAD edge is ROBUST to realistic borrow —
shorting cost is NOT the binding constraint; breadth is (the daily avearnings job fixes that).

4 new tests (borrow drag reduces short return, no_borrow drops shorts, per-symbol dict == flat,
+ the earlier window-skip test). Suite 3353 green. EDGE_CASE_STUDIES + PIPELINE docs updated (md+docx).

Co-Authored-By: Claude Opus 4.8 <noreply@anthropic.com>
</commit_message>
<xml_diff>
--- a/docs/EDGE_CASE_STUDIES.docx
+++ b/docs/EDGE_CASE_STUDIES.docx
@@ -3634,13 +3634,13 @@
         <w:rPr>
           <w:b/>
         </w:rPr>
-        <w:t>Verdict.</w:t>
+        <w:t>Shorting realism (now modeled).</w:t>
       </w:r>
       <w:r>
         <w:rPr>
           <w:b w:val="0"/>
         </w:rPr>
-        <w:t xml:space="preserve"> 🟢 **The strongest new candidate — the first thing besides the pairs basket that</w:t>
+        <w:t xml:space="preserve"> `backtest_pead` charges a daily stock-borrow fee on the</w:t>
       </w:r>
     </w:p>
     <w:p>
@@ -3648,7 +3648,7 @@
         <w:rPr>
           <w:b w:val="0"/>
         </w:rPr>
-        <w:t xml:space="preserve">  looks like a genuine, diversifying, market-neutral edge.** It holds across a real walk-forward</w:t>
+        <w:t xml:space="preserve">  short notional (`borrow_apr`, flat or per-symbol) and drops names with no locate (`no_borrow`).</w:t>
       </w:r>
     </w:p>
     <w:p>
@@ -3656,7 +3656,19 @@
         <w:rPr>
           <w:b w:val="0"/>
         </w:rPr>
-        <w:t xml:space="preserve">  and is *near* significant after deflation (DSR 0.92, just under the 0.95 bar). NOT a slam dunk:</w:t>
+        <w:t xml:space="preserve">  Stress on the dollar-neutral leg: Sharpe </w:t>
+      </w:r>
+      <w:r>
+        <w:rPr>
+          <w:b/>
+        </w:rPr>
+        <w:t>0.61 → 0.58</w:t>
+      </w:r>
+      <w:r>
+        <w:rPr>
+          <w:b w:val="0"/>
+        </w:rPr>
+        <w:t xml:space="preserve"> at a realistic large-cap general-</w:t>
       </w:r>
     </w:p>
     <w:p>
@@ -3664,7 +3676,31 @@
         <w:rPr>
           <w:b w:val="0"/>
         </w:rPr>
-        <w:t xml:space="preserve">  only 23 symbols (free-tier 25 req/day quota), 5-year window, and paper-shorting borrow/locate</w:t>
+        <w:t xml:space="preserve">  collateral borrow (~1%/yr) → </w:t>
+      </w:r>
+      <w:r>
+        <w:rPr>
+          <w:b/>
+        </w:rPr>
+        <w:t>0.53</w:t>
+      </w:r>
+      <w:r>
+        <w:rPr>
+          <w:b w:val="0"/>
+        </w:rPr>
+        <w:t xml:space="preserve"> at 3% → </w:t>
+      </w:r>
+      <w:r>
+        <w:rPr>
+          <w:b/>
+        </w:rPr>
+        <w:t>0.34</w:t>
+      </w:r>
+      <w:r>
+        <w:rPr>
+          <w:b w:val="0"/>
+        </w:rPr>
+        <w:t xml:space="preserve"> only under a 10% hard-to-borrow stress.</w:t>
       </w:r>
     </w:p>
     <w:p>
@@ -3672,7 +3708,23 @@
         <w:rPr>
           <w:b w:val="0"/>
         </w:rPr>
-        <w:t xml:space="preserve">  realism is unmodeled.</w:t>
+        <w:t xml:space="preserve">  Our universe is liquid S&amp;P large-caps (GC, ~0.3–1%), so **the edge is robust to realistic</w:t>
+      </w:r>
+    </w:p>
+    <w:p>
+      <w:r>
+        <w:rPr>
+          <w:b w:val="0"/>
+        </w:rPr>
+        <w:t xml:space="preserve">  borrow** — the drag is ~apr/2 per year on a dollar-neutral book. Shorting realism is *not* the</w:t>
+      </w:r>
+    </w:p>
+    <w:p>
+      <w:r>
+        <w:rPr>
+          <w:b w:val="0"/>
+        </w:rPr>
+        <w:t xml:space="preserve">  binding constraint.</w:t>
       </w:r>
     </w:p>
     <w:p>
@@ -3683,13 +3735,13 @@
         <w:rPr>
           <w:b/>
         </w:rPr>
-        <w:t>Next step.</w:t>
+        <w:t>Verdict.</w:t>
       </w:r>
       <w:r>
         <w:rPr>
           <w:b w:val="0"/>
         </w:rPr>
-        <w:t xml:space="preserve"> Broaden to more symbols (a few API-days, or a paid tier) to tighten the cross-</w:t>
+        <w:t xml:space="preserve"> 🟢 **The strongest new candidate — the first thing besides the pairs basket that</w:t>
       </w:r>
     </w:p>
     <w:p>
@@ -3697,7 +3749,7 @@
         <w:rPr>
           <w:b w:val="0"/>
         </w:rPr>
-        <w:t xml:space="preserve">  sectional deciles and push DSR over 0.95; model shorting realism; then it's a candidate second</w:t>
+        <w:t xml:space="preserve">  looks like a genuine, diversifying, market-neutral edge,** and it survives realistic borrow</w:t>
       </w:r>
     </w:p>
     <w:p>
@@ -3705,7 +3757,68 @@
         <w:rPr>
           <w:b w:val="0"/>
         </w:rPr>
-        <w:t xml:space="preserve">  leg for the combiner — uncorrelated to the pairs basket by construction.</w:t>
+        <w:t xml:space="preserve">  costs. *Near* significant after deflation (DSR 0.92, just under 0.95). The one binding</w:t>
+      </w:r>
+    </w:p>
+    <w:p>
+      <w:r>
+        <w:rPr>
+          <w:b w:val="0"/>
+        </w:rPr>
+        <w:t xml:space="preserve">  limitation is </w:t>
+      </w:r>
+      <w:r>
+        <w:rPr>
+          <w:b/>
+        </w:rPr>
+        <w:t>breadth</w:t>
+      </w:r>
+      <w:r>
+        <w:rPr>
+          <w:b w:val="0"/>
+        </w:rPr>
+        <w:t xml:space="preserve"> — only 23 symbols (free-tier 25 req/day), 5-year window.</w:t>
+      </w:r>
+    </w:p>
+    <w:p>
+      <w:pPr>
+        <w:pStyle w:val="ListBullet"/>
+      </w:pPr>
+      <w:r>
+        <w:rPr>
+          <w:b/>
+        </w:rPr>
+        <w:t>Next step.</w:t>
+      </w:r>
+      <w:r>
+        <w:rPr>
+          <w:b w:val="0"/>
+        </w:rPr>
+        <w:t xml:space="preserve"> The daily `avearnings` job is filling the full 195-symbol universe (~8 days),</w:t>
+      </w:r>
+    </w:p>
+    <w:p>
+      <w:r>
+        <w:rPr>
+          <w:b w:val="0"/>
+        </w:rPr>
+        <w:t xml:space="preserve">  which tightens the cross-sectional deciles and shrinks the Sharpe standard error — the direct</w:t>
+      </w:r>
+    </w:p>
+    <w:p>
+      <w:r>
+        <w:rPr>
+          <w:b w:val="0"/>
+        </w:rPr>
+        <w:t xml:space="preserve">  route to DSR &gt; 0.95. Then PEAD becomes the combiner's second leg (uncorrelated to the pairs</w:t>
+      </w:r>
+    </w:p>
+    <w:p>
+      <w:r>
+        <w:rPr>
+          <w:b w:val="0"/>
+        </w:rPr>
+        <w:t xml:space="preserve">  basket by construction).</w:t>
       </w:r>
     </w:p>
     <w:p>

</xml_diff>

<commit_message>
Case 21: refresh numbers on full SI fetch (56/195 symbols)
Universe fetch finished: only 56/195 symbols returned data from Nasdaq's free SI
endpoint (139 empty -- patchy free-tier coverage, another reason FINRA is the right
deepening path). Full-universe numbers settle slightly lower but the story holds and
is arguably cleaner -- IS AND within-year OOS now both positive:
  anomaly no-borrow     Sharpe 2.93  (IS 2.04 / OOS 4.44)  control -2.98 (mirror)
  anomaly + DTC borrow  Sharpe 2.34  (IS 1.37 / OOS 3.95)  PSR 0.99, DSR 0.98
  turnover 0.010/day
Verdict unchanged: strong 1yr lead, not validated (regime risk + 1yr depth + 56/195
coverage -> FINRA multi-year is the fix). EDGE_CASE_STUDIES Case 21 + scoreboard
refreshed (md+docx).

Co-Authored-By: Claude Opus 4.8 <noreply@anthropic.com>
</commit_message>
<xml_diff>
--- a/docs/EDGE_CASE_STUDIES.docx
+++ b/docs/EDGE_CASE_STUDIES.docx
@@ -2076,7 +2076,7 @@
               <w:rPr>
                 <w:b w:val="0"/>
               </w:rPr>
-              <w:t>Real Nasdaq SI; anomaly Sharpe 2.67 *after* DTC-scaled borrow, control mirrors −3.2, turnover 0.01/day</w:t>
+              <w:t>Real Nasdaq SI (56 sym); anomaly Sharpe 2.34 *after* DTC-scaled borrow, control mirrors −3.0, turnover 0.01/day</w:t>
             </w:r>
           </w:p>
         </w:tc>
@@ -8497,7 +8497,41 @@
         <w:rPr>
           <w:b/>
         </w:rPr>
-        <w:t>Result (preliminary, ~40 of 195 symbols cached, ~1-yr / 24 obs each).</w:t>
+        <w:t>Result (56 symbols, ~1-yr / ~23 obs each).</w:t>
+      </w:r>
+      <w:r>
+        <w:rPr>
+          <w:b w:val="0"/>
+        </w:rPr>
+        <w:t xml:space="preserve"> *Coverage caveat:* only </w:t>
+      </w:r>
+      <w:r>
+        <w:rPr>
+          <w:b/>
+        </w:rPr>
+        <w:t>56 of 195</w:t>
+      </w:r>
+      <w:r>
+        <w:rPr>
+          <w:b w:val="0"/>
+        </w:rPr>
+        <w:t xml:space="preserve"> universe</w:t>
+      </w:r>
+    </w:p>
+    <w:p>
+      <w:r>
+        <w:rPr>
+          <w:b w:val="0"/>
+        </w:rPr>
+        <w:t xml:space="preserve">  symbols returned data from Nasdaq's free SI endpoint (139 came back empty) — another reason the</w:t>
+      </w:r>
+    </w:p>
+    <w:p>
+      <w:r>
+        <w:rPr>
+          <w:b w:val="0"/>
+        </w:rPr>
+        <w:t xml:space="preserve">  full-coverage FINRA feed is the right deepening path.</w:t>
       </w:r>
     </w:p>
     <w:tbl>
@@ -8548,7 +8582,7 @@
               <w:rPr>
                 <w:b/>
               </w:rPr>
-              <w:t>within-yr OOS</w:t>
+              <w:t>IS / within-yr OOS</w:t>
             </w:r>
           </w:p>
         </w:tc>
@@ -8589,7 +8623,7 @@
               <w:rPr>
                 <w:b w:val="0"/>
               </w:rPr>
-              <w:t>~3.2</w:t>
+              <w:t>2.93</w:t>
             </w:r>
           </w:p>
         </w:tc>
@@ -8602,7 +8636,7 @@
               <w:rPr>
                 <w:b w:val="0"/>
               </w:rPr>
-              <w:t>+5.8</w:t>
+              <w:t>2.04 / 4.44</w:t>
             </w:r>
           </w:p>
         </w:tc>
@@ -8643,7 +8677,7 @@
               <w:rPr>
                 <w:b/>
               </w:rPr>
-              <w:t>−3.2</w:t>
+              <w:t>−2.98</w:t>
             </w:r>
           </w:p>
         </w:tc>
@@ -8656,7 +8690,7 @@
               <w:rPr>
                 <w:b w:val="0"/>
               </w:rPr>
-              <w:t>−5.9</w:t>
+              <w:t>−2.09 / −4.48</w:t>
             </w:r>
           </w:p>
         </w:tc>
@@ -8697,7 +8731,7 @@
               <w:rPr>
                 <w:b/>
               </w:rPr>
-              <w:t>2.67</w:t>
+              <w:t>2.34</w:t>
             </w:r>
           </w:p>
         </w:tc>
@@ -8710,7 +8744,7 @@
               <w:rPr>
                 <w:b w:val="0"/>
               </w:rPr>
-              <w:t>+5.3</w:t>
+              <w:t>1.37 / 3.95</w:t>
             </w:r>
           </w:p>
         </w:tc>
@@ -8748,23 +8782,31 @@
         <w:rPr>
           <w:b w:val="0"/>
         </w:rPr>
-        <w:t xml:space="preserve">  (Sharpe 2.67), low turnover, and statistically significant *within the year* (PSR 0.99; DSR 0.98</w:t>
-      </w:r>
-    </w:p>
-    <w:p>
-      <w:r>
-        <w:rPr>
-          <w:b w:val="0"/>
-        </w:rPr>
-        <w:t xml:space="preserve">  under a clean same-direction deflation). This is the **only scout-#1 signal that clears the bar</w:t>
-      </w:r>
-    </w:p>
-    <w:p>
-      <w:r>
-        <w:rPr>
-          <w:b w:val="0"/>
-        </w:rPr>
-        <w:t xml:space="preserve">  the others failed** — it is not a cost-wall casualty (Cases 17/20) nor a placebo failure (Case 19).</w:t>
+        <w:t xml:space="preserve">  (Sharpe 2.34, IS *and* within-year OOS both positive), low turnover, and statistically significant</w:t>
+      </w:r>
+    </w:p>
+    <w:p>
+      <w:r>
+        <w:rPr>
+          <w:b w:val="0"/>
+        </w:rPr>
+        <w:t xml:space="preserve">  within the year (PSR 0.99; DSR 0.98 under a clean same-direction deflation). This is the **only</w:t>
+      </w:r>
+    </w:p>
+    <w:p>
+      <w:r>
+        <w:rPr>
+          <w:b w:val="0"/>
+        </w:rPr>
+        <w:t xml:space="preserve">  scout-#1 signal that clears the bar the others failed** — not a cost-wall casualty (Cases 17/20)</w:t>
+      </w:r>
+    </w:p>
+    <w:p>
+      <w:r>
+        <w:rPr>
+          <w:b w:val="0"/>
+        </w:rPr>
+        <w:t xml:space="preserve">  nor a placebo failure (Case 19).</w:t>
       </w:r>
     </w:p>
     <w:p>
@@ -8904,15 +8946,15 @@
         <w:rPr>
           <w:b w:val="0"/>
         </w:rPr>
-        <w:t xml:space="preserve">  Until then it stays a lead, sized at zero. (The universe is still filling toward 195; the ~1-yr</w:t>
-      </w:r>
-    </w:p>
-    <w:p>
-      <w:r>
-        <w:rPr>
-          <w:b w:val="0"/>
-        </w:rPr>
-        <w:t xml:space="preserve">  depth, not breadth, is the limit.)</w:t>
+        <w:t xml:space="preserve">  Until then it stays a lead, sized at zero. (Both the ~1-yr depth *and* Nasdaq's 56/195 coverage</w:t>
+      </w:r>
+    </w:p>
+    <w:p>
+      <w:r>
+        <w:rPr>
+          <w:b w:val="0"/>
+        </w:rPr>
+        <w:t xml:space="preserve">  are limits FINRA fixes at once.)</w:t>
       </w:r>
     </w:p>
     <w:p>

</xml_diff>

<commit_message>
Case 21: cite definitive full-universe FINRA numbers (188 symbols)
The chained full-universe run finished and confirms/strengthens the rejection:
gross 0.91, net -0.42 after DTC-scaled borrow (vs -0.31 on the mid-fetch 156), DSR
0.07, positive 3/6 years (2021 -1.09, 2022 -2.38, 2023 +1.14, 2024 -1.12, 2025 +0.87,
2026 +0.28). Verdict unchanged; numbers updated to the complete universe (md+docx).

Co-Authored-By: Claude Opus 4.8 <noreply@anthropic.com>
</commit_message>
<xml_diff>
--- a/docs/EDGE_CASE_STUDIES.docx
+++ b/docs/EDGE_CASE_STUDIES.docx
@@ -2076,13 +2076,13 @@
               <w:rPr>
                 <w:b w:val="0"/>
               </w:rPr>
-              <w:t xml:space="preserve">1-yr Nasdaq looked great (2.34) but 9-yr FINRA: gross 0.92, </w:t>
+              <w:t xml:space="preserve">1-yr Nasdaq looked great (2.34) but 9-yr FINRA (188 sym): gross 0.91, </w:t>
             </w:r>
             <w:r>
               <w:rPr>
                 <w:b/>
               </w:rPr>
-              <w:t>net −0.31 after DTC borrow</w:t>
+              <w:t>net −0.42 after DTC borrow</w:t>
             </w:r>
             <w:r>
               <w:rPr>
@@ -8952,7 +8952,7 @@
         <w:rPr>
           <w:b/>
         </w:rPr>
-        <w:t>The multi-regime test (FINRA, ~9 yr / 156 symbols / ~201 obs each) DEMOLISHES it.</w:t>
+        <w:t>The multi-regime test (FINRA, ~9 yr / 188 symbols / ~201 obs each) DEMOLISHES it.</w:t>
       </w:r>
       <w:r>
         <w:rPr>
@@ -9060,7 +9060,7 @@
               <w:rPr>
                 <w:b w:val="0"/>
               </w:rPr>
-              <w:t>0.92</w:t>
+              <w:t>0.91</w:t>
             </w:r>
           </w:p>
         </w:tc>
@@ -9101,7 +9101,7 @@
               <w:rPr>
                 <w:b w:val="0"/>
               </w:rPr>
-              <w:t>0.66</w:t>
+              <w:t>0.63</w:t>
             </w:r>
           </w:p>
         </w:tc>
@@ -9142,7 +9142,7 @@
               <w:rPr>
                 <w:b/>
               </w:rPr>
-              <w:t>−0.31</w:t>
+              <w:t>−0.42</w:t>
             </w:r>
           </w:p>
         </w:tc>
@@ -9155,7 +9155,7 @@
               <w:rPr>
                 <w:b w:val="0"/>
               </w:rPr>
-              <w:t>2021 −1.56, 2022 −1.72, 2023 +0.89, 2024 −1.57, 2025 +1.18, 2026 +0.86</w:t>
+              <w:t>2021 −1.09, 2022 −2.38, 2023 +1.14, 2024 −1.12, 2025 +0.87, 2026 +0.28</w:t>
             </w:r>
           </w:p>
         </w:tc>
@@ -9178,7 +9178,7 @@
         <w:rPr>
           <w:b w:val="0"/>
         </w:rPr>
-        <w:t xml:space="preserve"> signal is *weak* (0.92, not ~3) and **regime-specific</w:t>
+        <w:t xml:space="preserve"> signal is *weak* (0.91, not ~3) and **regime-specific</w:t>
       </w:r>
     </w:p>
     <w:p>
@@ -9218,7 +9218,7 @@
         <w:rPr>
           <w:b w:val="0"/>
         </w:rPr>
-        <w:t>net-negative (−0.31, DSR 0.08)** — you must pay top borrow to short</w:t>
+        <w:t>net-negative (−0.42, DSR 0.07)** — you must pay top borrow to short</w:t>
       </w:r>
     </w:p>
     <w:p>

</xml_diff>

<commit_message>
Case 45 firmed on complete 1,707-name set: momentum ~0.43 gross / 0.30 borrow / 0.23 long-hedge
Full SIP delisted pull finished (691 non-empty / 1702 processed). Re-filtered -> 75 representative
mid-cap delistings (74 acquisitions / 1 failure — confirms genuine mid-caps get acquired, not bankrupt).
Definitive numbers, stable across 48->50->75-name sets: borrow-free L/S 0.43, adverse-borrow neutral
0.30, long/index-hedge 0.23. Adding representative delistings slightly REDUCES the L/S (0.46->0.43) —
zero survivorship boost, confirming the 1.35 was pure cherry-pick artifact. Updated all 3 docs + .docx.

Co-Authored-By: Claude Opus 4.8 <noreply@anthropic.com>
</commit_message>
<xml_diff>
--- a/docs/EDGE_CASE_STUDIES.docx
+++ b/docs/EDGE_CASE_STUDIES.docx
@@ -16651,7 +16651,7 @@
               <w:rPr>
                 <w:b/>
               </w:rPr>
-              <w:t>representative (Case 45)</w:t>
+              <w:t>representative (Case 45, full 1,707 set)</w:t>
             </w:r>
           </w:p>
         </w:tc>
@@ -16692,7 +16692,7 @@
               <w:rPr>
                 <w:b/>
               </w:rPr>
-              <w:t>0.49</w:t>
+              <w:t>0.43</w:t>
             </w:r>
           </w:p>
         </w:tc>
@@ -16733,7 +16733,7 @@
               <w:rPr>
                 <w:b/>
               </w:rPr>
-              <w:t>0.36</w:t>
+              <w:t>0.30</w:t>
             </w:r>
           </w:p>
         </w:tc>
@@ -16774,7 +16774,7 @@
               <w:rPr>
                 <w:b/>
               </w:rPr>
-              <w:t>+0.31</w:t>
+              <w:t>+0.23</w:t>
             </w:r>
           </w:p>
         </w:tc>
@@ -16785,23 +16785,63 @@
         <w:rPr>
           <w:b w:val="0"/>
         </w:rPr>
-        <w:t xml:space="preserve">  Adding *representative* delistings barely moves momentum (survivor 0.46 → 0.49) — the 0.39 → 1.35 jump</w:t>
-      </w:r>
-    </w:p>
-    <w:p>
-      <w:r>
-        <w:rPr>
-          <w:b w:val="0"/>
-        </w:rPr>
-        <w:t xml:space="preserve">  in Case 43 was entirely the cherry-picked bankruptcies over-feeding the short leg. **The 0.3–1.1 bracket</w:t>
-      </w:r>
-    </w:p>
-    <w:p>
-      <w:r>
-        <w:rPr>
-          <w:b w:val="0"/>
-        </w:rPr>
-        <w:t xml:space="preserve">  collapses to ~0.35–0.49.**</w:t>
+        <w:t xml:space="preserve">  Adding *representative* delistings doesn't help momentum — it slightly </w:t>
+      </w:r>
+      <w:r>
+        <w:rPr>
+          <w:b/>
+        </w:rPr>
+        <w:t>hurts</w:t>
+      </w:r>
+      <w:r>
+        <w:rPr>
+          <w:b w:val="0"/>
+        </w:rPr>
+        <w:t xml:space="preserve"> it (survivor 0.46 →</w:t>
+      </w:r>
+    </w:p>
+    <w:p>
+      <w:r>
+        <w:rPr>
+          <w:b w:val="0"/>
+        </w:rPr>
+        <w:t xml:space="preserve">  +delisted 0.43), because acquisitions jump to a fixed deal price and flatten, giving the short leg fewer</w:t>
+      </w:r>
+    </w:p>
+    <w:p>
+      <w:r>
+        <w:rPr>
+          <w:b w:val="0"/>
+        </w:rPr>
+        <w:t xml:space="preserve">  good trades. The 0.39 → 1.35 jump in Case 43 was entirely the cherry-picked bankruptcies over-feeding</w:t>
+      </w:r>
+    </w:p>
+    <w:p>
+      <w:r>
+        <w:rPr>
+          <w:b w:val="0"/>
+        </w:rPr>
+        <w:t xml:space="preserve">  the short leg. </w:t>
+      </w:r>
+      <w:r>
+        <w:rPr>
+          <w:b/>
+        </w:rPr>
+        <w:t>The 0.3–1.1 bracket collapses to ~0.3–0.45</w:t>
+      </w:r>
+      <w:r>
+        <w:rPr>
+          <w:b w:val="0"/>
+        </w:rPr>
+        <w:t xml:space="preserve"> (75 representative mid-cap delistings,</w:t>
+      </w:r>
+    </w:p>
+    <w:p>
+      <w:r>
+        <w:rPr>
+          <w:b w:val="0"/>
+        </w:rPr>
+        <w:t xml:space="preserve">  74 acquisitions / 1 failure — definitive on the complete 1,707-name pull).</w:t>
       </w:r>
     </w:p>
     <w:p>
@@ -16830,15 +16870,15 @@
         <w:rPr>
           <w:b w:val="0"/>
         </w:rPr>
-        <w:t xml:space="preserve"> (≈0.49</w:t>
-      </w:r>
-    </w:p>
-    <w:p>
-      <w:r>
-        <w:rPr>
-          <w:b w:val="0"/>
-        </w:rPr>
-        <w:t xml:space="preserve">  gross, ≈0.36 after adverse-selection borrow), not the 1.1+ the cherry-picked test implied — and the</w:t>
+        <w:t xml:space="preserve"> (≈0.43</w:t>
+      </w:r>
+    </w:p>
+    <w:p>
+      <w:r>
+        <w:rPr>
+          <w:b w:val="0"/>
+        </w:rPr>
+        <w:t xml:space="preserve">  gross, ≈0.30 after adverse-selection borrow), not the 1.1+ the cherry-picked test implied — and the</w:t>
       </w:r>
     </w:p>
     <w:p>
@@ -16852,89 +16892,81 @@
         <w:rPr>
           <w:b/>
         </w:rPr>
-        <w:t>small, not dramatic</w:t>
-      </w:r>
-      <w:r>
-        <w:rPr>
-          <w:b w:val="0"/>
-        </w:rPr>
-        <w:t>, once delistings are representative. Bonus:</w:t>
-      </w:r>
-    </w:p>
-    <w:p>
-      <w:r>
-        <w:rPr>
-          <w:b w:val="0"/>
-        </w:rPr>
-        <w:t xml:space="preserve">  the </w:t>
-      </w:r>
-      <w:r>
-        <w:rPr>
-          <w:b/>
-        </w:rPr>
-        <w:t>borrow-free long/index-hedged form is now positive (+0.31)</w:t>
-      </w:r>
-      <w:r>
-        <w:rPr>
-          <w:b w:val="0"/>
-        </w:rPr>
-        <w:t xml:space="preserve"> — because representative delistings</w:t>
-      </w:r>
-    </w:p>
-    <w:p>
-      <w:r>
-        <w:rPr>
-          <w:b w:val="0"/>
-        </w:rPr>
-        <w:t xml:space="preserve">  include acquired *winners* the long leg holds into a buyout premium — so a deployable, borrow-free sleeve</w:t>
-      </w:r>
-    </w:p>
-    <w:p>
-      <w:r>
-        <w:rPr>
-          <w:b w:val="0"/>
-        </w:rPr>
-        <w:t xml:space="preserve">  may exist at modest Sharpe (the earlier −0.12 was the cherry-picked failures starving the long leg).</w:t>
-      </w:r>
-    </w:p>
-    <w:p>
-      <w:r>
-        <w:rPr>
-          <w:b w:val="0"/>
-        </w:rPr>
-        <w:t xml:space="preserve">  **Net: momentum is a real but modest (~0.4) edge, uncorrelated with the pairs basket (gate #1), with a</w:t>
-      </w:r>
-    </w:p>
-    <w:p>
-      <w:r>
-        <w:rPr>
-          <w:b w:val="0"/>
-        </w:rPr>
-        <w:t xml:space="preserve">  plausible borrow-free long/hedged form (~0.3) — a credible weak second leg for the combiner, pending a</w:t>
-      </w:r>
-    </w:p>
-    <w:p>
-      <w:r>
-        <w:rPr>
-          <w:b w:val="0"/>
-        </w:rPr>
-        <w:t xml:space="preserve">  forward track.** *(Caveat: run on the A–R portion of the 1,707-name pull, 48 representative mid-cap</w:t>
-      </w:r>
-    </w:p>
-    <w:p>
-      <w:r>
-        <w:rPr>
-          <w:b w:val="0"/>
-        </w:rPr>
-        <w:t xml:space="preserve">  delistings; the full set will firm the number but the direction — bracket collapses to the low end — is</w:t>
-      </w:r>
-    </w:p>
-    <w:p>
-      <w:r>
-        <w:rPr>
-          <w:b w:val="0"/>
-        </w:rPr>
-        <w:t xml:space="preserve">  unambiguous since ticker letter is uncorrelated with returns.)* The lesson compounds Case 43: a</w:t>
+        <w:t>negligible (slightly negative), not a boost</w:t>
+      </w:r>
+      <w:r>
+        <w:rPr>
+          <w:b w:val="0"/>
+        </w:rPr>
+        <w:t>, once delistings are</w:t>
+      </w:r>
+    </w:p>
+    <w:p>
+      <w:r>
+        <w:rPr>
+          <w:b w:val="0"/>
+        </w:rPr>
+        <w:t xml:space="preserve">  representative. The </w:t>
+      </w:r>
+      <w:r>
+        <w:rPr>
+          <w:b/>
+        </w:rPr>
+        <w:t>borrow-free long/index-hedged form is mildly positive (+0.23)</w:t>
+      </w:r>
+      <w:r>
+        <w:rPr>
+          <w:b w:val="0"/>
+        </w:rPr>
+        <w:t xml:space="preserve"> — representative</w:t>
+      </w:r>
+    </w:p>
+    <w:p>
+      <w:r>
+        <w:rPr>
+          <w:b w:val="0"/>
+        </w:rPr>
+        <w:t xml:space="preserve">  delistings include acquired *winners* the long leg holds into a buyout premium — so a deployable,</w:t>
+      </w:r>
+    </w:p>
+    <w:p>
+      <w:r>
+        <w:rPr>
+          <w:b w:val="0"/>
+        </w:rPr>
+        <w:t xml:space="preserve">  borrow-free sleeve may exist at modest Sharpe (the cherry-picked −0.12 was the famous failures starving</w:t>
+      </w:r>
+    </w:p>
+    <w:p>
+      <w:r>
+        <w:rPr>
+          <w:b w:val="0"/>
+        </w:rPr>
+        <w:t xml:space="preserve">  the long leg). **Net: momentum is a real but modest (~0.4) edge, uncorrelated with the pairs basket</w:t>
+      </w:r>
+    </w:p>
+    <w:p>
+      <w:r>
+        <w:rPr>
+          <w:b w:val="0"/>
+        </w:rPr>
+        <w:t xml:space="preserve">  (gate #1), with a plausible borrow-free long/hedged form (~0.2) — a credible weak second leg for the</w:t>
+      </w:r>
+    </w:p>
+    <w:p>
+      <w:r>
+        <w:rPr>
+          <w:b w:val="0"/>
+        </w:rPr>
+        <w:t xml:space="preserve">  combiner, pending a forward track.** *(Numbers definitive on the complete 1,707-name pull: 75</w:t>
+      </w:r>
+    </w:p>
+    <w:p>
+      <w:r>
+        <w:rPr>
+          <w:b w:val="0"/>
+        </w:rPr>
+        <w:t xml:space="preserve">  representative mid-cap delistings; stable from the 48→50→75-name re-runs.)* The lesson compounds Case 43: a</w:t>
       </w:r>
     </w:p>
     <w:p>

</xml_diff>

<commit_message>
Case 50: short-vol TAIL STRESS — the 8% cap survives a simulated volmageddon
Responsible close on the tail-risk leg: instead of waiting for the un-sampled spike (2021-2026 had none;
worst SVXY day in-sample only -21%), SIMULATE it. Inject a catastrophic single-day SVXY shock (-40% Feb-2018
scale on the -0.5x fund / -50% realistic worst / -70% beyond-historical) at the combined book's WORST day
(joint stress), across 5/8/12% sizing.

At the DEPLOYED 8% cap: -40% -> -7.1% combined DD; -50% -> -5.1% day / -7.9% DD; -70% -> -6.7% / -9.4%.
Base DD -5.3%. The sizing IS the tail management -- short-vol is a small slice of a pairs-dominant (92%)
book, so even a -50% volmageddon only deepens the combined drawdown to -7.9%, and a beyond-historical -70%
gap stays under -10%. 8% cap VALIDATED, no re-cap needed. The disaster is quantified before it happens.

50 experiments. Docs md+Word updated. Suite green, 0 secrets.

Co-Authored-By: Claude Opus 4.8 <noreply@anthropic.com>
</commit_message>
<xml_diff>
--- a/docs/EDGE_CASE_STUDIES.docx
+++ b/docs/EDGE_CASE_STUDIES.docx
@@ -18458,6 +18458,197 @@
           <w:b w:val="0"/>
         </w:rPr>
         <w:t xml:space="preserve">  the eventual spike) adjudicate. The combiner finally has a leg that lifts it — with eyes open.</w:t>
+      </w:r>
+    </w:p>
+    <w:p>
+      <w:pPr>
+        <w:pStyle w:val="Heading2"/>
+      </w:pPr>
+      <w:r>
+        <w:t>Case 50 — Short-vol TAIL STRESS test ✅ (the 8% cap survives a simulated volmageddon)</w:t>
+      </w:r>
+    </w:p>
+    <w:p>
+      <w:pPr>
+        <w:pStyle w:val="ListBullet"/>
+      </w:pPr>
+      <w:r>
+        <w:rPr>
+          <w:b/>
+        </w:rPr>
+        <w:t>What.</w:t>
+      </w:r>
+      <w:r>
+        <w:rPr>
+          <w:b w:val="0"/>
+        </w:rPr>
+        <w:t xml:space="preserve"> Case 49's metrics understate short-vol's risk because 2021–2026 had no volmageddon (worst</w:t>
+      </w:r>
+    </w:p>
+    <w:p>
+      <w:r>
+        <w:rPr>
+          <w:b w:val="0"/>
+        </w:rPr>
+        <w:t xml:space="preserve">  SVXY day in-sample: only −21%). The responsible close is not to wait for the spike but to *simulate* it</w:t>
+      </w:r>
+    </w:p>
+    <w:p>
+      <w:r>
+        <w:rPr>
+          <w:b w:val="0"/>
+        </w:rPr>
+        <w:t xml:space="preserve">  and confirm the deployed hard cap protects the book. Injected a catastrophic single-day SVXY shock</w:t>
+      </w:r>
+    </w:p>
+    <w:p>
+      <w:r>
+        <w:rPr>
+          <w:b w:val="0"/>
+        </w:rPr>
+        <w:t xml:space="preserve">  (−40% ≈ Feb-2018-scale on the post-2018 −0.5× fund; −50% ≈ realistic worst; −70% ≈ beyond-historical /</w:t>
+      </w:r>
+    </w:p>
+    <w:p>
+      <w:r>
+        <w:rPr>
+          <w:b w:val="0"/>
+        </w:rPr>
+        <w:t xml:space="preserve">  model risk) at the combined book's </w:t>
+      </w:r>
+      <w:r>
+        <w:rPr>
+          <w:b/>
+        </w:rPr>
+        <w:t>worst</w:t>
+      </w:r>
+      <w:r>
+        <w:rPr>
+          <w:b w:val="0"/>
+        </w:rPr>
+        <w:t xml:space="preserve"> day (joint stress — vol spikes often coincide with pairs</w:t>
+      </w:r>
+    </w:p>
+    <w:p>
+      <w:r>
+        <w:rPr>
+          <w:b w:val="0"/>
+        </w:rPr>
+        <w:t xml:space="preserve">  spreads widening), across 5% / 8% / 12% sizing.</w:t>
+      </w:r>
+    </w:p>
+    <w:p>
+      <w:pPr>
+        <w:pStyle w:val="ListBullet"/>
+      </w:pPr>
+      <w:r>
+        <w:rPr>
+          <w:b/>
+        </w:rPr>
+        <w:t>Result — at the deployed 8% cap:</w:t>
+      </w:r>
+      <w:r>
+        <w:rPr>
+          <w:b w:val="0"/>
+        </w:rPr>
+        <w:t xml:space="preserve"> a −40% spike costs −4.3% on the day → −7.1% combined drawdown; a</w:t>
+      </w:r>
+    </w:p>
+    <w:p>
+      <w:r>
+        <w:rPr>
+          <w:b w:val="0"/>
+        </w:rPr>
+        <w:t xml:space="preserve">  realistic </w:t>
+      </w:r>
+      <w:r>
+        <w:rPr>
+          <w:b/>
+        </w:rPr>
+        <w:t>−50% spike → −5.1% day / −7.9% drawdown</w:t>
+      </w:r>
+      <w:r>
+        <w:rPr>
+          <w:b w:val="0"/>
+        </w:rPr>
+        <w:t>; a beyond-historical −70% gap → −6.7% / −9.4%.</w:t>
+      </w:r>
+    </w:p>
+    <w:p>
+      <w:r>
+        <w:rPr>
+          <w:b w:val="0"/>
+        </w:rPr>
+        <w:t xml:space="preserve">  At 12% the −70% case reaches −11.0%; at 5% it's −8.0%. The base (un-stressed) drawdown is −5.3%.</w:t>
+      </w:r>
+    </w:p>
+    <w:p>
+      <w:pPr>
+        <w:pStyle w:val="ListBullet"/>
+      </w:pPr>
+      <w:r>
+        <w:rPr>
+          <w:b/>
+        </w:rPr>
+        <w:t>Verdict.</w:t>
+      </w:r>
+      <w:r>
+        <w:rPr>
+          <w:b w:val="0"/>
+        </w:rPr>
+        <w:t xml:space="preserve"> ✅ </w:t>
+      </w:r>
+      <w:r>
+        <w:rPr>
+          <w:b/>
+        </w:rPr>
+        <w:t>The 8% hard cap is validated — the sizing IS the tail management.</w:t>
+      </w:r>
+      <w:r>
+        <w:rPr>
+          <w:b w:val="0"/>
+        </w:rPr>
+        <w:t xml:space="preserve"> Because short-vol</w:t>
+      </w:r>
+    </w:p>
+    <w:p>
+      <w:r>
+        <w:rPr>
+          <w:b w:val="0"/>
+        </w:rPr>
+        <w:t xml:space="preserve">  is a small slice of a pairs-dominant (92%) book, even a catastrophic −50% volmageddon only deepens the</w:t>
+      </w:r>
+    </w:p>
+    <w:p>
+      <w:r>
+        <w:rPr>
+          <w:b w:val="0"/>
+        </w:rPr>
+        <w:t xml:space="preserve">  combined drawdown from −5.3% to −7.9%, and a beyond-historical −70% gap stays under −10%. The known</w:t>
+      </w:r>
+    </w:p>
+    <w:p>
+      <w:r>
+        <w:rPr>
+          <w:b w:val="0"/>
+        </w:rPr>
+        <w:t xml:space="preserve">  failure mode is survivable at the deployed size; no re-cap needed. This is the honest discipline a</w:t>
+      </w:r>
+    </w:p>
+    <w:p>
+      <w:r>
+        <w:rPr>
+          <w:b w:val="0"/>
+        </w:rPr>
+        <w:t xml:space="preserve">  negatively-skewed leg demands — the disaster is quantified *before* it happens, and the position is</w:t>
+      </w:r>
+    </w:p>
+    <w:p>
+      <w:r>
+        <w:rPr>
+          <w:b w:val="0"/>
+        </w:rPr>
+        <w:t xml:space="preserve">  sized so it can't break the book. Short-vol stays on the forward track at 8%, eyes open.</w:t>
       </w:r>
     </w:p>
     <w:p>

</xml_diff>

<commit_message>
Case 51: cross-asset trend / managed-futures — REJECT (crisis-alpha thesis falsified)
Hunted leg #3 as a short-vol crash-hedge: trend famously = crisis alpha (CTAs thrive in vol spikes). Built
the diversified managed-futures sleeve on a 15-ETF cross-asset basket (vol-scaled 12mo TSMOM, goes short),
tested vs the two TSMOM-illusion controls (B&H, long-only-no-timing) + correlation to both legs + short-vol
tail-hedge + 3-leg combiner.

FAILS on every axis: trend Sharpe 0.31 LOSES to B&H 0.82 AND long-only 1.12 (timing illusory, Kim-2016
reproduced on cross-asset); per-year 2022 -0.72 / 2023 -1.02 (crisis-alpha thesis FAILED in the year it
should shine); rho vs short-vol +0.17 and -0.15%/day on short-vol's worst days (NO hedge); 3-leg combiner
0.93 dilutes the 2-leg book 1.07. Book stays at 2 legs (pairs+short-vol). Session hit rate 1/5 (short-vol
the only win) -- edges remain scarce. 51 experiments. Suite green, 0 secrets. md+Word.

Co-Authored-By: Claude Opus 4.8 <noreply@anthropic.com>
</commit_message>
<xml_diff>
--- a/docs/EDGE_CASE_STUDIES.docx
+++ b/docs/EDGE_CASE_STUDIES.docx
@@ -18649,6 +18649,371 @@
           <w:b w:val="0"/>
         </w:rPr>
         <w:t xml:space="preserve">  sized so it can't break the book. Short-vol stays on the forward track at 8%, eyes open.</w:t>
+      </w:r>
+    </w:p>
+    <w:p>
+      <w:pPr>
+        <w:pStyle w:val="Heading2"/>
+      </w:pPr>
+      <w:r>
+        <w:t>Case 51 — Cross-asset TREND / managed-futures (the short-vol tail hedge that wasn't) ❌</w:t>
+      </w:r>
+    </w:p>
+    <w:p>
+      <w:pPr>
+        <w:pStyle w:val="ListBullet"/>
+      </w:pPr>
+      <w:r>
+        <w:rPr>
+          <w:b/>
+        </w:rPr>
+        <w:t>What.</w:t>
+      </w:r>
+      <w:r>
+        <w:rPr>
+          <w:b w:val="0"/>
+        </w:rPr>
+        <w:t xml:space="preserve"> Short-vol's one weakness is its crash tail; the ideal 3rd leg would be *crisis alpha* —</w:t>
+      </w:r>
+    </w:p>
+    <w:p>
+      <w:r>
+        <w:rPr>
+          <w:b w:val="0"/>
+        </w:rPr>
+        <w:t xml:space="preserve">  cross-asset trend-following (CTAs) is famous for profiting in vol spikes (2022 was a banner year for</w:t>
+      </w:r>
+    </w:p>
+    <w:p>
+      <w:r>
+        <w:rPr>
+          <w:b w:val="0"/>
+        </w:rPr>
+        <w:t xml:space="preserve">  trend). So I built the canonical diversified managed-futures sleeve on a 15-ETF cross-asset basket</w:t>
+      </w:r>
+    </w:p>
+    <w:p>
+      <w:r>
+        <w:rPr>
+          <w:b w:val="0"/>
+        </w:rPr>
+        <w:t xml:space="preserve">  (equities/bonds/gold/commods/dollar/credit): per asset, sign of trailing 12-month return, vol-scaled to</w:t>
+      </w:r>
+    </w:p>
+    <w:p>
+      <w:r>
+        <w:rPr>
+          <w:b w:val="0"/>
+        </w:rPr>
+        <w:t xml:space="preserve">  equal risk, summed (it goes SHORT, so the *timing* must earn its keep) — and tested it against the two</w:t>
+      </w:r>
+    </w:p>
+    <w:p>
+      <w:r>
+        <w:rPr>
+          <w:b w:val="0"/>
+        </w:rPr>
+        <w:t xml:space="preserve">  controls that catch the TSMOM illusion (buy-and-hold, and long-only/no-timing), plus correlation to both</w:t>
+      </w:r>
+    </w:p>
+    <w:p>
+      <w:r>
+        <w:rPr>
+          <w:b w:val="0"/>
+        </w:rPr>
+        <w:t xml:space="preserve">  legs, the short-vol tail-hedge, and the 3-leg combiner.</w:t>
+      </w:r>
+    </w:p>
+    <w:p>
+      <w:pPr>
+        <w:pStyle w:val="ListBullet"/>
+      </w:pPr>
+      <w:r>
+        <w:rPr>
+          <w:b/>
+        </w:rPr>
+        <w:t>Result — fails on every axis:</w:t>
+      </w:r>
+    </w:p>
+    <w:p>
+      <w:pPr>
+        <w:pStyle w:val="ListBullet"/>
+      </w:pPr>
+      <w:r>
+        <w:rPr>
+          <w:b/>
+        </w:rPr>
+        <w:t>Timing is illusory:</w:t>
+      </w:r>
+      <w:r>
+        <w:rPr>
+          <w:b w:val="0"/>
+        </w:rPr>
+        <w:t xml:space="preserve"> trend Sharpe </w:t>
+      </w:r>
+      <w:r>
+        <w:rPr>
+          <w:b/>
+        </w:rPr>
+        <w:t>0.31</w:t>
+      </w:r>
+      <w:r>
+        <w:rPr>
+          <w:b w:val="0"/>
+        </w:rPr>
+        <w:t xml:space="preserve"> vs buy-and-hold </w:t>
+      </w:r>
+      <w:r>
+        <w:rPr>
+          <w:b/>
+        </w:rPr>
+        <w:t>0.82</w:t>
+      </w:r>
+      <w:r>
+        <w:rPr>
+          <w:b w:val="0"/>
+        </w:rPr>
+        <w:t xml:space="preserve"> and long-only-no-timing</w:t>
+      </w:r>
+    </w:p>
+    <w:p>
+      <w:r>
+        <w:rPr>
+          <w:b w:val="0"/>
+        </w:rPr>
+        <w:t xml:space="preserve">    </w:t>
+      </w:r>
+      <w:r>
+        <w:rPr>
+          <w:b/>
+        </w:rPr>
+        <w:t>1.12</w:t>
+      </w:r>
+      <w:r>
+        <w:rPr>
+          <w:b w:val="0"/>
+        </w:rPr>
+        <w:t xml:space="preserve"> — both controls *beat* it. The shorting/timing actively hurts (whipsaws); only the</w:t>
+      </w:r>
+    </w:p>
+    <w:p>
+      <w:r>
+        <w:rPr>
+          <w:b w:val="0"/>
+        </w:rPr>
+        <w:t xml:space="preserve">    vol-scaling has value. (Reproduces Kim-2016 on cross-asset.)</w:t>
+      </w:r>
+    </w:p>
+    <w:p>
+      <w:pPr>
+        <w:pStyle w:val="ListBullet"/>
+      </w:pPr>
+      <w:r>
+        <w:rPr>
+          <w:b/>
+        </w:rPr>
+        <w:t>Crisis-alpha thesis FAILS in-sample:</w:t>
+      </w:r>
+      <w:r>
+        <w:rPr>
+          <w:b w:val="0"/>
+        </w:rPr>
+        <w:t xml:space="preserve"> per-year </w:t>
+      </w:r>
+      <w:r>
+        <w:rPr>
+          <w:b/>
+        </w:rPr>
+        <w:t>2022 −0.72, 2023 −1.02</w:t>
+      </w:r>
+      <w:r>
+        <w:rPr>
+          <w:b w:val="0"/>
+        </w:rPr>
+        <w:t xml:space="preserve"> — trend *lost* in 2022,</w:t>
+      </w:r>
+    </w:p>
+    <w:p>
+      <w:r>
+        <w:rPr>
+          <w:b w:val="0"/>
+        </w:rPr>
+        <w:t xml:space="preserve">    the exact year it should have shone (my basket is equity/credit-heavy; the clean bond-short /</w:t>
+      </w:r>
+    </w:p>
+    <w:p>
+      <w:r>
+        <w:rPr>
+          <w:b w:val="0"/>
+        </w:rPr>
+        <w:t xml:space="preserve">    commodity-long signals got diluted and whipsawed).</w:t>
+      </w:r>
+    </w:p>
+    <w:p>
+      <w:pPr>
+        <w:pStyle w:val="ListBullet"/>
+      </w:pPr>
+      <w:r>
+        <w:rPr>
+          <w:b/>
+        </w:rPr>
+        <w:t>No tail hedge:</w:t>
+      </w:r>
+      <w:r>
+        <w:rPr>
+          <w:b w:val="0"/>
+        </w:rPr>
+        <w:t xml:space="preserve"> ρ vs short-vol </w:t>
+      </w:r>
+      <w:r>
+        <w:rPr>
+          <w:b/>
+        </w:rPr>
+        <w:t>+0.17</w:t>
+      </w:r>
+      <w:r>
+        <w:rPr>
+          <w:b w:val="0"/>
+        </w:rPr>
+        <w:t>; on short-vol's worst-10% days trend averages</w:t>
+      </w:r>
+    </w:p>
+    <w:p>
+      <w:r>
+        <w:rPr>
+          <w:b w:val="0"/>
+        </w:rPr>
+        <w:t xml:space="preserve">    </w:t>
+      </w:r>
+      <w:r>
+        <w:rPr>
+          <w:b/>
+        </w:rPr>
+        <w:t>−0.15%/day</w:t>
+      </w:r>
+      <w:r>
+        <w:rPr>
+          <w:b w:val="0"/>
+        </w:rPr>
+        <w:t xml:space="preserve"> — it does *not* offset the crash.</w:t>
+      </w:r>
+    </w:p>
+    <w:p>
+      <w:pPr>
+        <w:pStyle w:val="ListBullet"/>
+      </w:pPr>
+      <w:r>
+        <w:rPr>
+          <w:b/>
+        </w:rPr>
+        <w:t>3-leg combiner DILUTES:</w:t>
+      </w:r>
+      <w:r>
+        <w:rPr>
+          <w:b w:val="0"/>
+        </w:rPr>
+        <w:t xml:space="preserve"> 0.93 vs the 2-leg pairs+short-vol book </w:t>
+      </w:r>
+      <w:r>
+        <w:rPr>
+          <w:b/>
+        </w:rPr>
+        <w:t>1.07</w:t>
+      </w:r>
+      <w:r>
+        <w:rPr>
+          <w:b w:val="0"/>
+        </w:rPr>
+        <w:t xml:space="preserve"> (inverse-vol over-weights</w:t>
+      </w:r>
+    </w:p>
+    <w:p>
+      <w:r>
+        <w:rPr>
+          <w:b w:val="0"/>
+        </w:rPr>
+        <w:t xml:space="preserve">    the weak trend leg at 42%).</w:t>
+      </w:r>
+    </w:p>
+    <w:p>
+      <w:pPr>
+        <w:pStyle w:val="ListBullet"/>
+      </w:pPr>
+      <w:r>
+        <w:rPr>
+          <w:b/>
+        </w:rPr>
+        <w:t>Verdict.</w:t>
+      </w:r>
+      <w:r>
+        <w:rPr>
+          <w:b w:val="0"/>
+        </w:rPr>
+        <w:t xml:space="preserve"> ❌ </w:t>
+      </w:r>
+      <w:r>
+        <w:rPr>
+          <w:b/>
+        </w:rPr>
+        <w:t>REJECT.</w:t>
+      </w:r>
+      <w:r>
+        <w:rPr>
+          <w:b w:val="0"/>
+        </w:rPr>
+        <w:t xml:space="preserve"> A genuinely appealing thesis (trend as a crash hedge for short-vol),</w:t>
+      </w:r>
+    </w:p>
+    <w:p>
+      <w:r>
+        <w:rPr>
+          <w:b w:val="0"/>
+        </w:rPr>
+        <w:t xml:space="preserve">  falsified by measurement on every count. A faster-signal / cleaner-asset-class construction *might* do</w:t>
+      </w:r>
+    </w:p>
+    <w:p>
+      <w:r>
+        <w:rPr>
+          <w:b w:val="0"/>
+        </w:rPr>
+        <w:t xml:space="preserve">  better, but the controls (long-only beats timing by 0.8 Sharpe) put a high burden of proof on that —</w:t>
+      </w:r>
+    </w:p>
+    <w:p>
+      <w:r>
+        <w:rPr>
+          <w:b w:val="0"/>
+        </w:rPr>
+        <w:t xml:space="preserve">  the timing is the problem, not the tuning. </w:t>
+      </w:r>
+      <w:r>
+        <w:rPr>
+          <w:b/>
+        </w:rPr>
+        <w:t>Book stays at two legs (pairs + short-vol).</w:t>
+      </w:r>
+      <w:r>
+        <w:rPr>
+          <w:b w:val="0"/>
+        </w:rPr>
+        <w:t xml:space="preserve"> The hunt's</w:t>
+      </w:r>
+    </w:p>
+    <w:p>
+      <w:r>
+        <w:rPr>
+          <w:b w:val="0"/>
+        </w:rPr>
+        <w:t xml:space="preserve">  honest hit rate this session: 1 win (short-vol) in 5 candidates — edges remain scarce, exactly as the</w:t>
+      </w:r>
+    </w:p>
+    <w:p>
+      <w:r>
+        <w:rPr>
+          <w:b w:val="0"/>
+        </w:rPr>
+        <w:t xml:space="preserve">  program has found all along.</w:t>
       </w:r>
     </w:p>
     <w:p>

</xml_diff>

<commit_message>
Launch composite forward-track sleeve (Case 68 next step — survivorship-honest clock)
deploy_composite_paper.py: long-only top-quintile (no borrow) of the mom+value+SI
composite, monthly rebalance, marks prior book -> realized OOS curve. First run:
163-name universe, long 32. Wired as a PROBATION sleeve (weight 0) in portfolio.py +
into forward_track.sh + paper-edge DB (now 5 sleeves / 6 tracked strategies).

Why forward-track: the composite (0.64, t=2.05) is the strongest candidate but its
survivorship control is un-runnable on free data (no delisted EDGAR/SI). A forward
track is survivorship-honest by construction — trades names as they exist incl. future
delistings — so the live curve resolves the one open risk. Zero capital until earned.

Co-Authored-By: Claude Opus 4.8 <noreply@anthropic.com>
</commit_message>
<xml_diff>
--- a/docs/EDGE_CASE_STUDIES.docx
+++ b/docs/EDGE_CASE_STUDIES.docx
@@ -27949,6 +27949,50 @@
           <w:b w:val="0"/>
         </w:rPr>
         <w:t xml:space="preserve">  `data/composite_signal.json`.)</w:t>
+      </w:r>
+    </w:p>
+    <w:p>
+      <w:r>
+        <w:rPr>
+          <w:b w:val="0"/>
+        </w:rPr>
+        <w:t xml:space="preserve">  </w:t>
+      </w:r>
+      <w:r>
+        <w:rPr>
+          <w:b/>
+        </w:rPr>
+        <w:t>UPDATE (2026-06-24): forward sleeve LAUNCHED.</w:t>
+      </w:r>
+      <w:r>
+        <w:rPr>
+          <w:b w:val="0"/>
+        </w:rPr>
+        <w:t xml:space="preserve"> `scripts/deploy_composite_paper.py` (long-only</w:t>
+      </w:r>
+    </w:p>
+    <w:p>
+      <w:r>
+        <w:rPr>
+          <w:b w:val="0"/>
+        </w:rPr>
+        <w:t xml:space="preserve">  top-quintile, monthly rebalance, 163-name universe) is now a PROBATION sleeve (weight 0) in</w:t>
+      </w:r>
+    </w:p>
+    <w:p>
+      <w:r>
+        <w:rPr>
+          <w:b w:val="0"/>
+        </w:rPr>
+        <w:t xml:space="preserve">  `portfolio.py`, wired into the daily `forward_track.sh` + paper-edge DB — its survivorship-honest</w:t>
+      </w:r>
+    </w:p>
+    <w:p>
+      <w:r>
+        <w:rPr>
+          <w:b w:val="0"/>
+        </w:rPr>
+        <w:t xml:space="preserve">  forward clock is running.</w:t>
       </w:r>
     </w:p>
     <w:sectPr>

</xml_diff>